<commit_message>
docs: procedencia PurpleAir Collective, hoja de especificaciones, plan y presentacion actualizados para la reunion del 16/9
</commit_message>
<xml_diff>
--- a/docs/plan_despliegue.docx
+++ b/docs/plan_despliegue.docx
@@ -36,11 +36,13 @@
     </w:p>
     <w:p>
       <w:pPr>
-        <w:spacing w:after="300"/>
+        <w:spacing w:after="320"/>
       </w:pPr>
       <w:r>
         <w:rPr>
           <w:rFonts w:ascii="Calibri" w:cs="Calibri" w:eastAsia="Calibri" w:hAnsi="Calibri"/>
+          <w:i/>
+          <w:iCs/>
           <w:color w:val="6B5D4F"/>
           <w:sz w:val="20"/>
           <w:szCs w:val="20"/>
@@ -50,7 +52,8 @@
     </w:p>
     <w:p>
       <w:pPr>
-        <w:spacing w:after="120" w:before="260"/>
+        <w:pStyle w:val="Heading1"/>
+        <w:spacing w:after="160" w:before="320"/>
       </w:pPr>
       <w:r>
         <w:rPr>
@@ -58,15 +61,13 @@
           <w:b/>
           <w:bCs/>
           <w:color w:val="9B3D00"/>
-          <w:sz w:val="32"/>
-          <w:szCs w:val="32"/>
         </w:rPr>
         <w:t xml:space="preserve">1. Contexto</w:t>
       </w:r>
     </w:p>
     <w:p>
       <w:pPr>
-        <w:spacing w:after="120"/>
+        <w:spacing w:after="160" w:line="276"/>
       </w:pPr>
       <w:r>
         <w:rPr>
@@ -80,7 +81,7 @@
     </w:p>
     <w:p>
       <w:pPr>
-        <w:spacing w:after="120"/>
+        <w:spacing w:after="160" w:line="276"/>
       </w:pPr>
       <w:r>
         <w:rPr>
@@ -94,7 +95,8 @@
     </w:p>
     <w:p>
       <w:pPr>
-        <w:spacing w:after="120" w:before="260"/>
+        <w:pStyle w:val="Heading1"/>
+        <w:spacing w:after="160" w:before="320"/>
       </w:pPr>
       <w:r>
         <w:rPr>
@@ -102,15 +104,13 @@
           <w:b/>
           <w:bCs/>
           <w:color w:val="9B3D00"/>
-          <w:sz w:val="32"/>
-          <w:szCs w:val="32"/>
         </w:rPr>
         <w:t xml:space="preserve">2. Las 5 escuelas</w:t>
       </w:r>
     </w:p>
     <w:p>
       <w:pPr>
-        <w:spacing w:after="120"/>
+        <w:spacing w:after="160" w:line="276"/>
       </w:pPr>
       <w:r>
         <w:rPr>
@@ -119,7 +119,7 @@
           <w:sz w:val="22"/>
           <w:szCs w:val="22"/>
         </w:rPr>
-        <w:t xml:space="preserve">Selección confirmada: 3 escuelas en Saladillo y 2 en el partido de 25 de Mayo, cubriendo en ambos partidos al menos una zona urbana y una rural.</w:t>
+        <w:t xml:space="preserve">Selección: 4 escuelas confirmadas y 1 en proceso de reubicación (Colegio Secundario Madre Teresa) — 3 en Saladillo y 2 en el partido de 25 de Mayo, cubriendo en ambos partidos al menos una zona urbana y una rural.</w:t>
       </w:r>
     </w:p>
     <w:tbl>
@@ -147,12 +147,6 @@
         <w:tc>
           <w:tcPr>
             <w:tcW w:type="dxa" w:w="3100"/>
-            <w:tcBorders>
-              <w:top w:val="single" w:color="auto" w:sz="4"/>
-              <w:left w:val="single" w:color="auto" w:sz="4"/>
-              <w:bottom w:val="single" w:color="auto" w:sz="4"/>
-              <w:right w:val="single" w:color="auto" w:sz="4"/>
-            </w:tcBorders>
             <w:shd w:fill="9B3D00" w:val="clear"/>
             <w:tcMar>
               <w:top w:type="dxa" w:w="100"/>
@@ -163,6 +157,9 @@
             <w:vAlign w:val="center"/>
           </w:tcPr>
           <w:p>
+            <w:pPr>
+              <w:jc w:val="left"/>
+            </w:pPr>
             <w:r>
               <w:rPr>
                 <w:rFonts w:ascii="Calibri" w:cs="Calibri" w:eastAsia="Calibri" w:hAnsi="Calibri"/>
@@ -179,12 +176,6 @@
         <w:tc>
           <w:tcPr>
             <w:tcW w:type="dxa" w:w="1700"/>
-            <w:tcBorders>
-              <w:top w:val="single" w:color="auto" w:sz="4"/>
-              <w:left w:val="single" w:color="auto" w:sz="4"/>
-              <w:bottom w:val="single" w:color="auto" w:sz="4"/>
-              <w:right w:val="single" w:color="auto" w:sz="4"/>
-            </w:tcBorders>
             <w:shd w:fill="9B3D00" w:val="clear"/>
             <w:tcMar>
               <w:top w:type="dxa" w:w="100"/>
@@ -195,6 +186,9 @@
             <w:vAlign w:val="center"/>
           </w:tcPr>
           <w:p>
+            <w:pPr>
+              <w:jc w:val="left"/>
+            </w:pPr>
             <w:r>
               <w:rPr>
                 <w:rFonts w:ascii="Calibri" w:cs="Calibri" w:eastAsia="Calibri" w:hAnsi="Calibri"/>
@@ -211,12 +205,6 @@
         <w:tc>
           <w:tcPr>
             <w:tcW w:type="dxa" w:w="1300"/>
-            <w:tcBorders>
-              <w:top w:val="single" w:color="auto" w:sz="4"/>
-              <w:left w:val="single" w:color="auto" w:sz="4"/>
-              <w:bottom w:val="single" w:color="auto" w:sz="4"/>
-              <w:right w:val="single" w:color="auto" w:sz="4"/>
-            </w:tcBorders>
             <w:shd w:fill="9B3D00" w:val="clear"/>
             <w:tcMar>
               <w:top w:type="dxa" w:w="100"/>
@@ -227,6 +215,9 @@
             <w:vAlign w:val="center"/>
           </w:tcPr>
           <w:p>
+            <w:pPr>
+              <w:jc w:val="left"/>
+            </w:pPr>
             <w:r>
               <w:rPr>
                 <w:rFonts w:ascii="Calibri" w:cs="Calibri" w:eastAsia="Calibri" w:hAnsi="Calibri"/>
@@ -243,12 +234,6 @@
         <w:tc>
           <w:tcPr>
             <w:tcW w:type="dxa" w:w="2700"/>
-            <w:tcBorders>
-              <w:top w:val="single" w:color="auto" w:sz="4"/>
-              <w:left w:val="single" w:color="auto" w:sz="4"/>
-              <w:bottom w:val="single" w:color="auto" w:sz="4"/>
-              <w:right w:val="single" w:color="auto" w:sz="4"/>
-            </w:tcBorders>
             <w:shd w:fill="9B3D00" w:val="clear"/>
             <w:tcMar>
               <w:top w:type="dxa" w:w="100"/>
@@ -259,6 +244,9 @@
             <w:vAlign w:val="center"/>
           </w:tcPr>
           <w:p>
+            <w:pPr>
+              <w:jc w:val="left"/>
+            </w:pPr>
             <w:r>
               <w:rPr>
                 <w:rFonts w:ascii="Calibri" w:cs="Calibri" w:eastAsia="Calibri" w:hAnsi="Calibri"/>
@@ -274,28 +262,22 @@
         </w:tc>
       </w:tr>
       <w:tr>
-        <w:trPr>
-          <w:cantSplit/>
-        </w:trPr>
         <w:tc>
           <w:tcPr>
             <w:tcW w:type="dxa" w:w="3100"/>
-            <w:tcBorders>
-              <w:top w:val="single" w:color="auto" w:sz="4"/>
-              <w:left w:val="single" w:color="auto" w:sz="4"/>
-              <w:bottom w:val="single" w:color="auto" w:sz="4"/>
-              <w:right w:val="single" w:color="auto" w:sz="4"/>
-            </w:tcBorders>
-            <w:shd w:fill="F0EBE2" w:val="clear"/>
-            <w:tcMar>
-              <w:top w:type="dxa" w:w="100"/>
-              <w:left w:type="dxa" w:w="120"/>
-              <w:bottom w:type="dxa" w:w="100"/>
-              <w:right w:type="dxa" w:w="120"/>
-            </w:tcMar>
-            <w:vAlign w:val="center"/>
-          </w:tcPr>
-          <w:p>
+            <w:shd w:fill="F0EBE2" w:val="clear"/>
+            <w:tcMar>
+              <w:top w:type="dxa" w:w="100"/>
+              <w:left w:type="dxa" w:w="120"/>
+              <w:bottom w:type="dxa" w:w="100"/>
+              <w:right w:type="dxa" w:w="120"/>
+            </w:tcMar>
+            <w:vAlign w:val="center"/>
+          </w:tcPr>
+          <w:p>
+            <w:pPr>
+              <w:jc w:val="left"/>
+            </w:pPr>
             <w:r>
               <w:rPr>
                 <w:rFonts w:ascii="Calibri" w:cs="Calibri" w:eastAsia="Calibri" w:hAnsi="Calibri"/>
@@ -305,29 +287,26 @@
                 <w:sz w:val="20"/>
                 <w:szCs w:val="20"/>
               </w:rPr>
-              <w:t xml:space="preserve">EES N°2 "Manuel Pardal"</w:t>
+              <w:t xml:space="preserve">Esc. de Educación Secundaria N°2 "Manuel Pardal"</w:t>
             </w:r>
           </w:p>
         </w:tc>
         <w:tc>
           <w:tcPr>
             <w:tcW w:type="dxa" w:w="1700"/>
-            <w:tcBorders>
-              <w:top w:val="single" w:color="auto" w:sz="4"/>
-              <w:left w:val="single" w:color="auto" w:sz="4"/>
-              <w:bottom w:val="single" w:color="auto" w:sz="4"/>
-              <w:right w:val="single" w:color="auto" w:sz="4"/>
-            </w:tcBorders>
-            <w:shd w:fill="F0EBE2" w:val="clear"/>
-            <w:tcMar>
-              <w:top w:type="dxa" w:w="100"/>
-              <w:left w:type="dxa" w:w="120"/>
-              <w:bottom w:type="dxa" w:w="100"/>
-              <w:right w:type="dxa" w:w="120"/>
-            </w:tcMar>
-            <w:vAlign w:val="center"/>
-          </w:tcPr>
-          <w:p>
+            <w:shd w:fill="F0EBE2" w:val="clear"/>
+            <w:tcMar>
+              <w:top w:type="dxa" w:w="100"/>
+              <w:left w:type="dxa" w:w="120"/>
+              <w:bottom w:type="dxa" w:w="100"/>
+              <w:right w:type="dxa" w:w="120"/>
+            </w:tcMar>
+            <w:vAlign w:val="center"/>
+          </w:tcPr>
+          <w:p>
+            <w:pPr>
+              <w:jc w:val="left"/>
+            </w:pPr>
             <w:r>
               <w:rPr>
                 <w:rFonts w:ascii="Calibri" w:cs="Calibri" w:eastAsia="Calibri" w:hAnsi="Calibri"/>
@@ -344,22 +323,19 @@
         <w:tc>
           <w:tcPr>
             <w:tcW w:type="dxa" w:w="1300"/>
-            <w:tcBorders>
-              <w:top w:val="single" w:color="auto" w:sz="4"/>
-              <w:left w:val="single" w:color="auto" w:sz="4"/>
-              <w:bottom w:val="single" w:color="auto" w:sz="4"/>
-              <w:right w:val="single" w:color="auto" w:sz="4"/>
-            </w:tcBorders>
-            <w:shd w:fill="F0EBE2" w:val="clear"/>
-            <w:tcMar>
-              <w:top w:type="dxa" w:w="100"/>
-              <w:left w:type="dxa" w:w="120"/>
-              <w:bottom w:type="dxa" w:w="100"/>
-              <w:right w:type="dxa" w:w="120"/>
-            </w:tcMar>
-            <w:vAlign w:val="center"/>
-          </w:tcPr>
-          <w:p>
+            <w:shd w:fill="F0EBE2" w:val="clear"/>
+            <w:tcMar>
+              <w:top w:type="dxa" w:w="100"/>
+              <w:left w:type="dxa" w:w="120"/>
+              <w:bottom w:type="dxa" w:w="100"/>
+              <w:right w:type="dxa" w:w="120"/>
+            </w:tcMar>
+            <w:vAlign w:val="center"/>
+          </w:tcPr>
+          <w:p>
+            <w:pPr>
+              <w:jc w:val="left"/>
+            </w:pPr>
             <w:r>
               <w:rPr>
                 <w:rFonts w:ascii="Calibri" w:cs="Calibri" w:eastAsia="Calibri" w:hAnsi="Calibri"/>
@@ -376,22 +352,19 @@
         <w:tc>
           <w:tcPr>
             <w:tcW w:type="dxa" w:w="2700"/>
-            <w:tcBorders>
-              <w:top w:val="single" w:color="auto" w:sz="4"/>
-              <w:left w:val="single" w:color="auto" w:sz="4"/>
-              <w:bottom w:val="single" w:color="auto" w:sz="4"/>
-              <w:right w:val="single" w:color="auto" w:sz="4"/>
-            </w:tcBorders>
-            <w:shd w:fill="F0EBE2" w:val="clear"/>
-            <w:tcMar>
-              <w:top w:type="dxa" w:w="100"/>
-              <w:left w:type="dxa" w:w="120"/>
-              <w:bottom w:type="dxa" w:w="100"/>
-              <w:right w:type="dxa" w:w="120"/>
-            </w:tcMar>
-            <w:vAlign w:val="center"/>
-          </w:tcPr>
-          <w:p>
+            <w:shd w:fill="F0EBE2" w:val="clear"/>
+            <w:tcMar>
+              <w:top w:type="dxa" w:w="100"/>
+              <w:left w:type="dxa" w:w="120"/>
+              <w:bottom w:type="dxa" w:w="100"/>
+              <w:right w:type="dxa" w:w="120"/>
+            </w:tcMar>
+            <w:vAlign w:val="center"/>
+          </w:tcPr>
+          <w:p>
+            <w:pPr>
+              <w:jc w:val="left"/>
+            </w:pPr>
             <w:r>
               <w:rPr>
                 <w:rFonts w:ascii="Calibri" w:cs="Calibri" w:eastAsia="Calibri" w:hAnsi="Calibri"/>
@@ -407,18 +380,9 @@
         </w:tc>
       </w:tr>
       <w:tr>
-        <w:trPr>
-          <w:cantSplit/>
-        </w:trPr>
         <w:tc>
           <w:tcPr>
             <w:tcW w:type="dxa" w:w="3100"/>
-            <w:tcBorders>
-              <w:top w:val="single" w:color="auto" w:sz="4"/>
-              <w:left w:val="single" w:color="auto" w:sz="4"/>
-              <w:bottom w:val="single" w:color="auto" w:sz="4"/>
-              <w:right w:val="single" w:color="auto" w:sz="4"/>
-            </w:tcBorders>
             <w:shd w:fill="FFFFFF" w:val="clear"/>
             <w:tcMar>
               <w:top w:type="dxa" w:w="100"/>
@@ -429,6 +393,9 @@
             <w:vAlign w:val="center"/>
           </w:tcPr>
           <w:p>
+            <w:pPr>
+              <w:jc w:val="left"/>
+            </w:pPr>
             <w:r>
               <w:rPr>
                 <w:rFonts w:ascii="Calibri" w:cs="Calibri" w:eastAsia="Calibri" w:hAnsi="Calibri"/>
@@ -445,12 +412,6 @@
         <w:tc>
           <w:tcPr>
             <w:tcW w:type="dxa" w:w="1700"/>
-            <w:tcBorders>
-              <w:top w:val="single" w:color="auto" w:sz="4"/>
-              <w:left w:val="single" w:color="auto" w:sz="4"/>
-              <w:bottom w:val="single" w:color="auto" w:sz="4"/>
-              <w:right w:val="single" w:color="auto" w:sz="4"/>
-            </w:tcBorders>
             <w:shd w:fill="FFFFFF" w:val="clear"/>
             <w:tcMar>
               <w:top w:type="dxa" w:w="100"/>
@@ -461,6 +422,9 @@
             <w:vAlign w:val="center"/>
           </w:tcPr>
           <w:p>
+            <w:pPr>
+              <w:jc w:val="left"/>
+            </w:pPr>
             <w:r>
               <w:rPr>
                 <w:rFonts w:ascii="Calibri" w:cs="Calibri" w:eastAsia="Calibri" w:hAnsi="Calibri"/>
@@ -477,12 +441,6 @@
         <w:tc>
           <w:tcPr>
             <w:tcW w:type="dxa" w:w="1300"/>
-            <w:tcBorders>
-              <w:top w:val="single" w:color="auto" w:sz="4"/>
-              <w:left w:val="single" w:color="auto" w:sz="4"/>
-              <w:bottom w:val="single" w:color="auto" w:sz="4"/>
-              <w:right w:val="single" w:color="auto" w:sz="4"/>
-            </w:tcBorders>
             <w:shd w:fill="FFFFFF" w:val="clear"/>
             <w:tcMar>
               <w:top w:type="dxa" w:w="100"/>
@@ -493,6 +451,9 @@
             <w:vAlign w:val="center"/>
           </w:tcPr>
           <w:p>
+            <w:pPr>
+              <w:jc w:val="left"/>
+            </w:pPr>
             <w:r>
               <w:rPr>
                 <w:rFonts w:ascii="Calibri" w:cs="Calibri" w:eastAsia="Calibri" w:hAnsi="Calibri"/>
@@ -509,12 +470,6 @@
         <w:tc>
           <w:tcPr>
             <w:tcW w:type="dxa" w:w="2700"/>
-            <w:tcBorders>
-              <w:top w:val="single" w:color="auto" w:sz="4"/>
-              <w:left w:val="single" w:color="auto" w:sz="4"/>
-              <w:bottom w:val="single" w:color="auto" w:sz="4"/>
-              <w:right w:val="single" w:color="auto" w:sz="4"/>
-            </w:tcBorders>
             <w:shd w:fill="FFFFFF" w:val="clear"/>
             <w:tcMar>
               <w:top w:type="dxa" w:w="100"/>
@@ -525,6 +480,9 @@
             <w:vAlign w:val="center"/>
           </w:tcPr>
           <w:p>
+            <w:pPr>
+              <w:jc w:val="left"/>
+            </w:pPr>
             <w:r>
               <w:rPr>
                 <w:rFonts w:ascii="Calibri" w:cs="Calibri" w:eastAsia="Calibri" w:hAnsi="Calibri"/>
@@ -540,28 +498,22 @@
         </w:tc>
       </w:tr>
       <w:tr>
-        <w:trPr>
-          <w:cantSplit/>
-        </w:trPr>
         <w:tc>
           <w:tcPr>
             <w:tcW w:type="dxa" w:w="3100"/>
-            <w:tcBorders>
-              <w:top w:val="single" w:color="auto" w:sz="4"/>
-              <w:left w:val="single" w:color="auto" w:sz="4"/>
-              <w:bottom w:val="single" w:color="auto" w:sz="4"/>
-              <w:right w:val="single" w:color="auto" w:sz="4"/>
-            </w:tcBorders>
-            <w:shd w:fill="F0EBE2" w:val="clear"/>
-            <w:tcMar>
-              <w:top w:type="dxa" w:w="100"/>
-              <w:left w:type="dxa" w:w="120"/>
-              <w:bottom w:type="dxa" w:w="100"/>
-              <w:right w:type="dxa" w:w="120"/>
-            </w:tcMar>
-            <w:vAlign w:val="center"/>
-          </w:tcPr>
-          <w:p>
+            <w:shd w:fill="F0EBE2" w:val="clear"/>
+            <w:tcMar>
+              <w:top w:type="dxa" w:w="100"/>
+              <w:left w:type="dxa" w:w="120"/>
+              <w:bottom w:type="dxa" w:w="100"/>
+              <w:right w:type="dxa" w:w="120"/>
+            </w:tcMar>
+            <w:vAlign w:val="center"/>
+          </w:tcPr>
+          <w:p>
+            <w:pPr>
+              <w:jc w:val="left"/>
+            </w:pPr>
             <w:r>
               <w:rPr>
                 <w:rFonts w:ascii="Calibri" w:cs="Calibri" w:eastAsia="Calibri" w:hAnsi="Calibri"/>
@@ -578,22 +530,19 @@
         <w:tc>
           <w:tcPr>
             <w:tcW w:type="dxa" w:w="1700"/>
-            <w:tcBorders>
-              <w:top w:val="single" w:color="auto" w:sz="4"/>
-              <w:left w:val="single" w:color="auto" w:sz="4"/>
-              <w:bottom w:val="single" w:color="auto" w:sz="4"/>
-              <w:right w:val="single" w:color="auto" w:sz="4"/>
-            </w:tcBorders>
-            <w:shd w:fill="F0EBE2" w:val="clear"/>
-            <w:tcMar>
-              <w:top w:type="dxa" w:w="100"/>
-              <w:left w:type="dxa" w:w="120"/>
-              <w:bottom w:type="dxa" w:w="100"/>
-              <w:right w:type="dxa" w:w="120"/>
-            </w:tcMar>
-            <w:vAlign w:val="center"/>
-          </w:tcPr>
-          <w:p>
+            <w:shd w:fill="F0EBE2" w:val="clear"/>
+            <w:tcMar>
+              <w:top w:type="dxa" w:w="100"/>
+              <w:left w:type="dxa" w:w="120"/>
+              <w:bottom w:type="dxa" w:w="100"/>
+              <w:right w:type="dxa" w:w="120"/>
+            </w:tcMar>
+            <w:vAlign w:val="center"/>
+          </w:tcPr>
+          <w:p>
+            <w:pPr>
+              <w:jc w:val="left"/>
+            </w:pPr>
             <w:r>
               <w:rPr>
                 <w:rFonts w:ascii="Calibri" w:cs="Calibri" w:eastAsia="Calibri" w:hAnsi="Calibri"/>
@@ -610,28 +559,25 @@
         <w:tc>
           <w:tcPr>
             <w:tcW w:type="dxa" w:w="1300"/>
-            <w:tcBorders>
-              <w:top w:val="single" w:color="auto" w:sz="4"/>
-              <w:left w:val="single" w:color="auto" w:sz="4"/>
-              <w:bottom w:val="single" w:color="auto" w:sz="4"/>
-              <w:right w:val="single" w:color="auto" w:sz="4"/>
-            </w:tcBorders>
-            <w:shd w:fill="F0EBE2" w:val="clear"/>
-            <w:tcMar>
-              <w:top w:type="dxa" w:w="100"/>
-              <w:left w:type="dxa" w:w="120"/>
-              <w:bottom w:type="dxa" w:w="100"/>
-              <w:right w:type="dxa" w:w="120"/>
-            </w:tcMar>
-            <w:vAlign w:val="center"/>
-          </w:tcPr>
-          <w:p>
-            <w:r>
-              <w:rPr>
-                <w:rFonts w:ascii="Calibri" w:cs="Calibri" w:eastAsia="Calibri" w:hAnsi="Calibri"/>
-                <w:b w:val="false"/>
-                <w:bCs w:val="false"/>
-                <w:color w:val="9B3D00"/>
+            <w:shd w:fill="F0EBE2" w:val="clear"/>
+            <w:tcMar>
+              <w:top w:type="dxa" w:w="100"/>
+              <w:left w:type="dxa" w:w="120"/>
+              <w:bottom w:type="dxa" w:w="100"/>
+              <w:right w:type="dxa" w:w="120"/>
+            </w:tcMar>
+            <w:vAlign w:val="center"/>
+          </w:tcPr>
+          <w:p>
+            <w:pPr>
+              <w:jc w:val="left"/>
+            </w:pPr>
+            <w:r>
+              <w:rPr>
+                <w:rFonts w:ascii="Calibri" w:cs="Calibri" w:eastAsia="Calibri" w:hAnsi="Calibri"/>
+                <w:b w:val="false"/>
+                <w:bCs w:val="false"/>
+                <w:color w:val="D9691F"/>
                 <w:sz w:val="20"/>
                 <w:szCs w:val="20"/>
               </w:rPr>
@@ -642,49 +588,37 @@
         <w:tc>
           <w:tcPr>
             <w:tcW w:type="dxa" w:w="2700"/>
-            <w:tcBorders>
-              <w:top w:val="single" w:color="auto" w:sz="4"/>
-              <w:left w:val="single" w:color="auto" w:sz="4"/>
-              <w:bottom w:val="single" w:color="auto" w:sz="4"/>
-              <w:right w:val="single" w:color="auto" w:sz="4"/>
-            </w:tcBorders>
-            <w:shd w:fill="F0EBE2" w:val="clear"/>
-            <w:tcMar>
-              <w:top w:type="dxa" w:w="100"/>
-              <w:left w:type="dxa" w:w="120"/>
-              <w:bottom w:type="dxa" w:w="100"/>
-              <w:right w:type="dxa" w:w="120"/>
-            </w:tcMar>
-            <w:vAlign w:val="center"/>
-          </w:tcPr>
-          <w:p>
-            <w:r>
-              <w:rPr>
-                <w:rFonts w:ascii="Calibri" w:cs="Calibri" w:eastAsia="Calibri" w:hAnsi="Calibri"/>
-                <w:b w:val="false"/>
-                <w:bCs w:val="false"/>
-                <w:color w:val="2A1D12"/>
-                <w:sz w:val="20"/>
-                <w:szCs w:val="20"/>
-              </w:rPr>
-              <w:t xml:space="preserve">Calle Jauretche e Yrigoyen</w:t>
+            <w:shd w:fill="F0EBE2" w:val="clear"/>
+            <w:tcMar>
+              <w:top w:type="dxa" w:w="100"/>
+              <w:left w:type="dxa" w:w="120"/>
+              <w:bottom w:type="dxa" w:w="100"/>
+              <w:right w:type="dxa" w:w="120"/>
+            </w:tcMar>
+            <w:vAlign w:val="center"/>
+          </w:tcPr>
+          <w:p>
+            <w:pPr>
+              <w:jc w:val="left"/>
+            </w:pPr>
+            <w:r>
+              <w:rPr>
+                <w:rFonts w:ascii="Calibri" w:cs="Calibri" w:eastAsia="Calibri" w:hAnsi="Calibri"/>
+                <w:b w:val="false"/>
+                <w:bCs w:val="false"/>
+                <w:color w:val="2A1D12"/>
+                <w:sz w:val="20"/>
+                <w:szCs w:val="20"/>
+              </w:rPr>
+              <w:t xml:space="preserve">Calle Jauretche e Yrigoyen (en reubicación — a confirmar)</w:t>
             </w:r>
           </w:p>
         </w:tc>
       </w:tr>
       <w:tr>
-        <w:trPr>
-          <w:cantSplit/>
-        </w:trPr>
         <w:tc>
           <w:tcPr>
             <w:tcW w:type="dxa" w:w="3100"/>
-            <w:tcBorders>
-              <w:top w:val="single" w:color="auto" w:sz="4"/>
-              <w:left w:val="single" w:color="auto" w:sz="4"/>
-              <w:bottom w:val="single" w:color="auto" w:sz="4"/>
-              <w:right w:val="single" w:color="auto" w:sz="4"/>
-            </w:tcBorders>
             <w:shd w:fill="FFFFFF" w:val="clear"/>
             <w:tcMar>
               <w:top w:type="dxa" w:w="100"/>
@@ -695,6 +629,9 @@
             <w:vAlign w:val="center"/>
           </w:tcPr>
           <w:p>
+            <w:pPr>
+              <w:jc w:val="left"/>
+            </w:pPr>
             <w:r>
               <w:rPr>
                 <w:rFonts w:ascii="Calibri" w:cs="Calibri" w:eastAsia="Calibri" w:hAnsi="Calibri"/>
@@ -711,12 +648,6 @@
         <w:tc>
           <w:tcPr>
             <w:tcW w:type="dxa" w:w="1700"/>
-            <w:tcBorders>
-              <w:top w:val="single" w:color="auto" w:sz="4"/>
-              <w:left w:val="single" w:color="auto" w:sz="4"/>
-              <w:bottom w:val="single" w:color="auto" w:sz="4"/>
-              <w:right w:val="single" w:color="auto" w:sz="4"/>
-            </w:tcBorders>
             <w:shd w:fill="FFFFFF" w:val="clear"/>
             <w:tcMar>
               <w:top w:type="dxa" w:w="100"/>
@@ -727,6 +658,9 @@
             <w:vAlign w:val="center"/>
           </w:tcPr>
           <w:p>
+            <w:pPr>
+              <w:jc w:val="left"/>
+            </w:pPr>
             <w:r>
               <w:rPr>
                 <w:rFonts w:ascii="Calibri" w:cs="Calibri" w:eastAsia="Calibri" w:hAnsi="Calibri"/>
@@ -743,12 +677,6 @@
         <w:tc>
           <w:tcPr>
             <w:tcW w:type="dxa" w:w="1300"/>
-            <w:tcBorders>
-              <w:top w:val="single" w:color="auto" w:sz="4"/>
-              <w:left w:val="single" w:color="auto" w:sz="4"/>
-              <w:bottom w:val="single" w:color="auto" w:sz="4"/>
-              <w:right w:val="single" w:color="auto" w:sz="4"/>
-            </w:tcBorders>
             <w:shd w:fill="FFFFFF" w:val="clear"/>
             <w:tcMar>
               <w:top w:type="dxa" w:w="100"/>
@@ -759,6 +687,9 @@
             <w:vAlign w:val="center"/>
           </w:tcPr>
           <w:p>
+            <w:pPr>
+              <w:jc w:val="left"/>
+            </w:pPr>
             <w:r>
               <w:rPr>
                 <w:rFonts w:ascii="Calibri" w:cs="Calibri" w:eastAsia="Calibri" w:hAnsi="Calibri"/>
@@ -775,12 +706,6 @@
         <w:tc>
           <w:tcPr>
             <w:tcW w:type="dxa" w:w="2700"/>
-            <w:tcBorders>
-              <w:top w:val="single" w:color="auto" w:sz="4"/>
-              <w:left w:val="single" w:color="auto" w:sz="4"/>
-              <w:bottom w:val="single" w:color="auto" w:sz="4"/>
-              <w:right w:val="single" w:color="auto" w:sz="4"/>
-            </w:tcBorders>
             <w:shd w:fill="FFFFFF" w:val="clear"/>
             <w:tcMar>
               <w:top w:type="dxa" w:w="100"/>
@@ -791,6 +716,9 @@
             <w:vAlign w:val="center"/>
           </w:tcPr>
           <w:p>
+            <w:pPr>
+              <w:jc w:val="left"/>
+            </w:pPr>
             <w:r>
               <w:rPr>
                 <w:rFonts w:ascii="Calibri" w:cs="Calibri" w:eastAsia="Calibri" w:hAnsi="Calibri"/>
@@ -806,28 +734,22 @@
         </w:tc>
       </w:tr>
       <w:tr>
-        <w:trPr>
-          <w:cantSplit/>
-        </w:trPr>
         <w:tc>
           <w:tcPr>
             <w:tcW w:type="dxa" w:w="3100"/>
-            <w:tcBorders>
-              <w:top w:val="single" w:color="auto" w:sz="4"/>
-              <w:left w:val="single" w:color="auto" w:sz="4"/>
-              <w:bottom w:val="single" w:color="auto" w:sz="4"/>
-              <w:right w:val="single" w:color="auto" w:sz="4"/>
-            </w:tcBorders>
-            <w:shd w:fill="F0EBE2" w:val="clear"/>
-            <w:tcMar>
-              <w:top w:type="dxa" w:w="100"/>
-              <w:left w:type="dxa" w:w="120"/>
-              <w:bottom w:type="dxa" w:w="100"/>
-              <w:right w:type="dxa" w:w="120"/>
-            </w:tcMar>
-            <w:vAlign w:val="center"/>
-          </w:tcPr>
-          <w:p>
+            <w:shd w:fill="F0EBE2" w:val="clear"/>
+            <w:tcMar>
+              <w:top w:type="dxa" w:w="100"/>
+              <w:left w:type="dxa" w:w="120"/>
+              <w:bottom w:type="dxa" w:w="100"/>
+              <w:right w:type="dxa" w:w="120"/>
+            </w:tcMar>
+            <w:vAlign w:val="center"/>
+          </w:tcPr>
+          <w:p>
+            <w:pPr>
+              <w:jc w:val="left"/>
+            </w:pPr>
             <w:r>
               <w:rPr>
                 <w:rFonts w:ascii="Calibri" w:cs="Calibri" w:eastAsia="Calibri" w:hAnsi="Calibri"/>
@@ -844,22 +766,19 @@
         <w:tc>
           <w:tcPr>
             <w:tcW w:type="dxa" w:w="1700"/>
-            <w:tcBorders>
-              <w:top w:val="single" w:color="auto" w:sz="4"/>
-              <w:left w:val="single" w:color="auto" w:sz="4"/>
-              <w:bottom w:val="single" w:color="auto" w:sz="4"/>
-              <w:right w:val="single" w:color="auto" w:sz="4"/>
-            </w:tcBorders>
-            <w:shd w:fill="F0EBE2" w:val="clear"/>
-            <w:tcMar>
-              <w:top w:type="dxa" w:w="100"/>
-              <w:left w:type="dxa" w:w="120"/>
-              <w:bottom w:type="dxa" w:w="100"/>
-              <w:right w:type="dxa" w:w="120"/>
-            </w:tcMar>
-            <w:vAlign w:val="center"/>
-          </w:tcPr>
-          <w:p>
+            <w:shd w:fill="F0EBE2" w:val="clear"/>
+            <w:tcMar>
+              <w:top w:type="dxa" w:w="100"/>
+              <w:left w:type="dxa" w:w="120"/>
+              <w:bottom w:type="dxa" w:w="100"/>
+              <w:right w:type="dxa" w:w="120"/>
+            </w:tcMar>
+            <w:vAlign w:val="center"/>
+          </w:tcPr>
+          <w:p>
+            <w:pPr>
+              <w:jc w:val="left"/>
+            </w:pPr>
             <w:r>
               <w:rPr>
                 <w:rFonts w:ascii="Calibri" w:cs="Calibri" w:eastAsia="Calibri" w:hAnsi="Calibri"/>
@@ -876,28 +795,25 @@
         <w:tc>
           <w:tcPr>
             <w:tcW w:type="dxa" w:w="1300"/>
-            <w:tcBorders>
-              <w:top w:val="single" w:color="auto" w:sz="4"/>
-              <w:left w:val="single" w:color="auto" w:sz="4"/>
-              <w:bottom w:val="single" w:color="auto" w:sz="4"/>
-              <w:right w:val="single" w:color="auto" w:sz="4"/>
-            </w:tcBorders>
-            <w:shd w:fill="F0EBE2" w:val="clear"/>
-            <w:tcMar>
-              <w:top w:type="dxa" w:w="100"/>
-              <w:left w:type="dxa" w:w="120"/>
-              <w:bottom w:type="dxa" w:w="100"/>
-              <w:right w:type="dxa" w:w="120"/>
-            </w:tcMar>
-            <w:vAlign w:val="center"/>
-          </w:tcPr>
-          <w:p>
-            <w:r>
-              <w:rPr>
-                <w:rFonts w:ascii="Calibri" w:cs="Calibri" w:eastAsia="Calibri" w:hAnsi="Calibri"/>
-                <w:b w:val="false"/>
-                <w:bCs w:val="false"/>
-                <w:color w:val="9B3D00"/>
+            <w:shd w:fill="F0EBE2" w:val="clear"/>
+            <w:tcMar>
+              <w:top w:type="dxa" w:w="100"/>
+              <w:left w:type="dxa" w:w="120"/>
+              <w:bottom w:type="dxa" w:w="100"/>
+              <w:right w:type="dxa" w:w="120"/>
+            </w:tcMar>
+            <w:vAlign w:val="center"/>
+          </w:tcPr>
+          <w:p>
+            <w:pPr>
+              <w:jc w:val="left"/>
+            </w:pPr>
+            <w:r>
+              <w:rPr>
+                <w:rFonts w:ascii="Calibri" w:cs="Calibri" w:eastAsia="Calibri" w:hAnsi="Calibri"/>
+                <w:b w:val="false"/>
+                <w:bCs w:val="false"/>
+                <w:color w:val="D9691F"/>
                 <w:sz w:val="20"/>
                 <w:szCs w:val="20"/>
               </w:rPr>
@@ -908,22 +824,19 @@
         <w:tc>
           <w:tcPr>
             <w:tcW w:type="dxa" w:w="2700"/>
-            <w:tcBorders>
-              <w:top w:val="single" w:color="auto" w:sz="4"/>
-              <w:left w:val="single" w:color="auto" w:sz="4"/>
-              <w:bottom w:val="single" w:color="auto" w:sz="4"/>
-              <w:right w:val="single" w:color="auto" w:sz="4"/>
-            </w:tcBorders>
-            <w:shd w:fill="F0EBE2" w:val="clear"/>
-            <w:tcMar>
-              <w:top w:type="dxa" w:w="100"/>
-              <w:left w:type="dxa" w:w="120"/>
-              <w:bottom w:type="dxa" w:w="100"/>
-              <w:right w:type="dxa" w:w="120"/>
-            </w:tcMar>
-            <w:vAlign w:val="center"/>
-          </w:tcPr>
-          <w:p>
+            <w:shd w:fill="F0EBE2" w:val="clear"/>
+            <w:tcMar>
+              <w:top w:type="dxa" w:w="100"/>
+              <w:left w:type="dxa" w:w="120"/>
+              <w:bottom w:type="dxa" w:w="100"/>
+              <w:right w:type="dxa" w:w="120"/>
+            </w:tcMar>
+            <w:vAlign w:val="center"/>
+          </w:tcPr>
+          <w:p>
+            <w:pPr>
+              <w:jc w:val="left"/>
+            </w:pPr>
             <w:r>
               <w:rPr>
                 <w:rFonts w:ascii="Calibri" w:cs="Calibri" w:eastAsia="Calibri" w:hAnsi="Calibri"/>
@@ -941,70 +854,13 @@
     </w:tbl>
     <w:p>
       <w:pPr>
-        <w:spacing w:before="240"/>
-        <w:jc w:val="center"/>
-      </w:pPr>
-      <w:r>
-        <w:drawing>
-          <wp:inline distT="0" distB="0" distL="0" distR="0">
-            <wp:extent cx="5429250" cy="3533775"/>
-            <wp:effectExtent t="0" r="0" b="0" l="0"/>
-            <wp:docPr id="1" name="" descr="" title=""/>
-            <wp:cNvGraphicFramePr>
-              <a:graphicFrameLocks xmlns:a="http://schemas.openxmlformats.org/drawingml/2006/main" noChangeAspect="1"/>
-            </wp:cNvGraphicFramePr>
-            <a:graphic xmlns:a="http://schemas.openxmlformats.org/drawingml/2006/main">
-              <a:graphicData uri="http://schemas.openxmlformats.org/drawingml/2006/picture">
-                <pic:pic xmlns:pic="http://schemas.openxmlformats.org/drawingml/2006/picture">
-                  <pic:nvPicPr>
-                    <pic:cNvPr id="0" name="" descr=""/>
-                    <pic:cNvPicPr>
-                      <a:picLocks noChangeAspect="1" noChangeArrowheads="1"/>
-                    </pic:cNvPicPr>
-                  </pic:nvPicPr>
-                  <pic:blipFill>
-                    <a:blip r:embed="rId7" cstate="none"/>
-                    <a:srcRect/>
-                    <a:stretch>
-                      <a:fillRect/>
-                    </a:stretch>
-                  </pic:blipFill>
-                  <pic:spPr bwMode="auto">
-                    <a:xfrm>
-                      <a:off x="0" y="0"/>
-                      <a:ext cx="5429250" cy="3533775"/>
-                    </a:xfrm>
-                    <a:prstGeom prst="rect">
-                      <a:avLst/>
-                    </a:prstGeom>
-                  </pic:spPr>
-                </pic:pic>
-              </a:graphicData>
-            </a:graphic>
-          </wp:inline>
-        </w:drawing>
-      </w:r>
-    </w:p>
-    <w:p>
-      <w:pPr>
-        <w:spacing w:after="240" w:before="60"/>
-        <w:jc w:val="center"/>
-      </w:pPr>
-      <w:r>
-        <w:rPr>
-          <w:rFonts w:ascii="Calibri" w:cs="Calibri" w:eastAsia="Calibri" w:hAnsi="Calibri"/>
-          <w:i/>
-          <w:iCs/>
-          <w:color w:val="6B5D4F"/>
-          <w:sz w:val="18"/>
-          <w:szCs w:val="18"/>
-        </w:rPr>
-        <w:t xml:space="preserve">Ubicación de las 5 escuelas — partidos de Saladillo y 25 de Mayo</w:t>
-      </w:r>
-    </w:p>
-    <w:p>
-      <w:pPr>
-        <w:spacing w:after="120" w:before="260"/>
+        <w:spacing w:after="160" w:before="160"/>
+      </w:pPr>
+    </w:p>
+    <w:p>
+      <w:pPr>
+        <w:pStyle w:val="Heading1"/>
+        <w:spacing w:after="160" w:before="320"/>
       </w:pPr>
       <w:r>
         <w:rPr>
@@ -1012,15 +868,13 @@
           <w:b/>
           <w:bCs/>
           <w:color w:val="9B3D00"/>
-          <w:sz w:val="32"/>
-          <w:szCs w:val="32"/>
         </w:rPr>
         <w:t xml:space="preserve">3. Qué se instala</w:t>
       </w:r>
     </w:p>
     <w:p>
       <w:pPr>
-        <w:spacing w:after="120"/>
+        <w:spacing w:after="160" w:line="276"/>
       </w:pPr>
       <w:r>
         <w:rPr>
@@ -1034,7 +888,7 @@
     </w:p>
     <w:p>
       <w:pPr>
-        <w:spacing w:after="120"/>
+        <w:spacing w:after="160" w:line="276"/>
       </w:pPr>
       <w:r>
         <w:rPr>
@@ -1048,70 +902,8 @@
     </w:p>
     <w:p>
       <w:pPr>
-        <w:spacing w:before="120"/>
-        <w:jc w:val="center"/>
-      </w:pPr>
-      <w:r>
-        <w:drawing>
-          <wp:inline distT="0" distB="0" distL="0" distR="0">
-            <wp:extent cx="3048000" cy="2286000"/>
-            <wp:effectExtent t="0" r="0" b="0" l="0"/>
-            <wp:docPr id="1" name="" descr="" title=""/>
-            <wp:cNvGraphicFramePr>
-              <a:graphicFrameLocks xmlns:a="http://schemas.openxmlformats.org/drawingml/2006/main" noChangeAspect="1"/>
-            </wp:cNvGraphicFramePr>
-            <a:graphic xmlns:a="http://schemas.openxmlformats.org/drawingml/2006/main">
-              <a:graphicData uri="http://schemas.openxmlformats.org/drawingml/2006/picture">
-                <pic:pic xmlns:pic="http://schemas.openxmlformats.org/drawingml/2006/picture">
-                  <pic:nvPicPr>
-                    <pic:cNvPr id="0" name="" descr=""/>
-                    <pic:cNvPicPr>
-                      <a:picLocks noChangeAspect="1" noChangeArrowheads="1"/>
-                    </pic:cNvPicPr>
-                  </pic:nvPicPr>
-                  <pic:blipFill>
-                    <a:blip r:embed="rId8" cstate="none"/>
-                    <a:srcRect/>
-                    <a:stretch>
-                      <a:fillRect/>
-                    </a:stretch>
-                  </pic:blipFill>
-                  <pic:spPr bwMode="auto">
-                    <a:xfrm>
-                      <a:off x="0" y="0"/>
-                      <a:ext cx="3048000" cy="2286000"/>
-                    </a:xfrm>
-                    <a:prstGeom prst="rect">
-                      <a:avLst/>
-                    </a:prstGeom>
-                  </pic:spPr>
-                </pic:pic>
-              </a:graphicData>
-            </a:graphic>
-          </wp:inline>
-        </w:drawing>
-      </w:r>
-    </w:p>
-    <w:p>
-      <w:pPr>
-        <w:spacing w:after="240" w:before="60"/>
-        <w:jc w:val="center"/>
-      </w:pPr>
-      <w:r>
-        <w:rPr>
-          <w:rFonts w:ascii="Calibri" w:cs="Calibri" w:eastAsia="Calibri" w:hAnsi="Calibri"/>
-          <w:i/>
-          <w:iCs/>
-          <w:color w:val="6B5D4F"/>
-          <w:sz w:val="18"/>
-          <w:szCs w:val="18"/>
-        </w:rPr>
-        <w:t xml:space="preserve">Sensor AirGradient instalado — antecedente 2023, Programa de Embajadores OpenAQ</w:t>
-      </w:r>
-    </w:p>
-    <w:p>
-      <w:pPr>
-        <w:spacing w:after="120" w:before="260"/>
+        <w:pStyle w:val="Heading1"/>
+        <w:spacing w:after="160" w:before="320"/>
       </w:pPr>
       <w:r>
         <w:rPr>
@@ -1119,8 +911,6 @@
           <w:b/>
           <w:bCs/>
           <w:color w:val="9B3D00"/>
-          <w:sz w:val="32"/>
-          <w:szCs w:val="32"/>
         </w:rPr>
         <w:t xml:space="preserve">4. Qué necesitamos de cada institución</w:t>
       </w:r>
@@ -1148,12 +938,6 @@
         <w:tc>
           <w:tcPr>
             <w:tcW w:type="dxa" w:w="2600"/>
-            <w:tcBorders>
-              <w:top w:val="single" w:color="auto" w:sz="4"/>
-              <w:left w:val="single" w:color="auto" w:sz="4"/>
-              <w:bottom w:val="single" w:color="auto" w:sz="4"/>
-              <w:right w:val="single" w:color="auto" w:sz="4"/>
-            </w:tcBorders>
             <w:shd w:fill="9B3D00" w:val="clear"/>
             <w:tcMar>
               <w:top w:type="dxa" w:w="100"/>
@@ -1164,6 +948,9 @@
             <w:vAlign w:val="center"/>
           </w:tcPr>
           <w:p>
+            <w:pPr>
+              <w:jc w:val="left"/>
+            </w:pPr>
             <w:r>
               <w:rPr>
                 <w:rFonts w:ascii="Calibri" w:cs="Calibri" w:eastAsia="Calibri" w:hAnsi="Calibri"/>
@@ -1180,12 +967,6 @@
         <w:tc>
           <w:tcPr>
             <w:tcW w:type="dxa" w:w="6200"/>
-            <w:tcBorders>
-              <w:top w:val="single" w:color="auto" w:sz="4"/>
-              <w:left w:val="single" w:color="auto" w:sz="4"/>
-              <w:bottom w:val="single" w:color="auto" w:sz="4"/>
-              <w:right w:val="single" w:color="auto" w:sz="4"/>
-            </w:tcBorders>
             <w:shd w:fill="9B3D00" w:val="clear"/>
             <w:tcMar>
               <w:top w:type="dxa" w:w="100"/>
@@ -1196,6 +977,9 @@
             <w:vAlign w:val="center"/>
           </w:tcPr>
           <w:p>
+            <w:pPr>
+              <w:jc w:val="left"/>
+            </w:pPr>
             <w:r>
               <w:rPr>
                 <w:rFonts w:ascii="Calibri" w:cs="Calibri" w:eastAsia="Calibri" w:hAnsi="Calibri"/>
@@ -1211,28 +995,22 @@
         </w:tc>
       </w:tr>
       <w:tr>
-        <w:trPr>
-          <w:cantSplit/>
-        </w:trPr>
         <w:tc>
           <w:tcPr>
             <w:tcW w:type="dxa" w:w="2600"/>
-            <w:tcBorders>
-              <w:top w:val="single" w:color="auto" w:sz="4"/>
-              <w:left w:val="single" w:color="auto" w:sz="4"/>
-              <w:bottom w:val="single" w:color="auto" w:sz="4"/>
-              <w:right w:val="single" w:color="auto" w:sz="4"/>
-            </w:tcBorders>
-            <w:shd w:fill="F0EBE2" w:val="clear"/>
-            <w:tcMar>
-              <w:top w:type="dxa" w:w="100"/>
-              <w:left w:type="dxa" w:w="120"/>
-              <w:bottom w:type="dxa" w:w="100"/>
-              <w:right w:type="dxa" w:w="120"/>
-            </w:tcMar>
-            <w:vAlign w:val="center"/>
-          </w:tcPr>
-          <w:p>
+            <w:shd w:fill="F0EBE2" w:val="clear"/>
+            <w:tcMar>
+              <w:top w:type="dxa" w:w="100"/>
+              <w:left w:type="dxa" w:w="120"/>
+              <w:bottom w:type="dxa" w:w="100"/>
+              <w:right w:type="dxa" w:w="120"/>
+            </w:tcMar>
+            <w:vAlign w:val="center"/>
+          </w:tcPr>
+          <w:p>
+            <w:pPr>
+              <w:jc w:val="left"/>
+            </w:pPr>
             <w:r>
               <w:rPr>
                 <w:rFonts w:ascii="Calibri" w:cs="Calibri" w:eastAsia="Calibri" w:hAnsi="Calibri"/>
@@ -1249,22 +1027,19 @@
         <w:tc>
           <w:tcPr>
             <w:tcW w:type="dxa" w:w="6200"/>
-            <w:tcBorders>
-              <w:top w:val="single" w:color="auto" w:sz="4"/>
-              <w:left w:val="single" w:color="auto" w:sz="4"/>
-              <w:bottom w:val="single" w:color="auto" w:sz="4"/>
-              <w:right w:val="single" w:color="auto" w:sz="4"/>
-            </w:tcBorders>
-            <w:shd w:fill="F0EBE2" w:val="clear"/>
-            <w:tcMar>
-              <w:top w:type="dxa" w:w="100"/>
-              <w:left w:type="dxa" w:w="120"/>
-              <w:bottom w:type="dxa" w:w="100"/>
-              <w:right w:type="dxa" w:w="120"/>
-            </w:tcMar>
-            <w:vAlign w:val="center"/>
-          </w:tcPr>
-          <w:p>
+            <w:shd w:fill="F0EBE2" w:val="clear"/>
+            <w:tcMar>
+              <w:top w:type="dxa" w:w="100"/>
+              <w:left w:type="dxa" w:w="120"/>
+              <w:bottom w:type="dxa" w:w="100"/>
+              <w:right w:type="dxa" w:w="120"/>
+            </w:tcMar>
+            <w:vAlign w:val="center"/>
+          </w:tcPr>
+          <w:p>
+            <w:pPr>
+              <w:jc w:val="left"/>
+            </w:pPr>
             <w:r>
               <w:rPr>
                 <w:rFonts w:ascii="Calibri" w:cs="Calibri" w:eastAsia="Calibri" w:hAnsi="Calibri"/>
@@ -1280,18 +1055,9 @@
         </w:tc>
       </w:tr>
       <w:tr>
-        <w:trPr>
-          <w:cantSplit/>
-        </w:trPr>
         <w:tc>
           <w:tcPr>
             <w:tcW w:type="dxa" w:w="2600"/>
-            <w:tcBorders>
-              <w:top w:val="single" w:color="auto" w:sz="4"/>
-              <w:left w:val="single" w:color="auto" w:sz="4"/>
-              <w:bottom w:val="single" w:color="auto" w:sz="4"/>
-              <w:right w:val="single" w:color="auto" w:sz="4"/>
-            </w:tcBorders>
             <w:shd w:fill="FFFFFF" w:val="clear"/>
             <w:tcMar>
               <w:top w:type="dxa" w:w="100"/>
@@ -1302,6 +1068,9 @@
             <w:vAlign w:val="center"/>
           </w:tcPr>
           <w:p>
+            <w:pPr>
+              <w:jc w:val="left"/>
+            </w:pPr>
             <w:r>
               <w:rPr>
                 <w:rFonts w:ascii="Calibri" w:cs="Calibri" w:eastAsia="Calibri" w:hAnsi="Calibri"/>
@@ -1318,12 +1087,6 @@
         <w:tc>
           <w:tcPr>
             <w:tcW w:type="dxa" w:w="6200"/>
-            <w:tcBorders>
-              <w:top w:val="single" w:color="auto" w:sz="4"/>
-              <w:left w:val="single" w:color="auto" w:sz="4"/>
-              <w:bottom w:val="single" w:color="auto" w:sz="4"/>
-              <w:right w:val="single" w:color="auto" w:sz="4"/>
-            </w:tcBorders>
             <w:shd w:fill="FFFFFF" w:val="clear"/>
             <w:tcMar>
               <w:top w:type="dxa" w:w="100"/>
@@ -1334,6 +1097,9 @@
             <w:vAlign w:val="center"/>
           </w:tcPr>
           <w:p>
+            <w:pPr>
+              <w:jc w:val="left"/>
+            </w:pPr>
             <w:r>
               <w:rPr>
                 <w:rFonts w:ascii="Calibri" w:cs="Calibri" w:eastAsia="Calibri" w:hAnsi="Calibri"/>
@@ -1349,28 +1115,22 @@
         </w:tc>
       </w:tr>
       <w:tr>
-        <w:trPr>
-          <w:cantSplit/>
-        </w:trPr>
         <w:tc>
           <w:tcPr>
             <w:tcW w:type="dxa" w:w="2600"/>
-            <w:tcBorders>
-              <w:top w:val="single" w:color="auto" w:sz="4"/>
-              <w:left w:val="single" w:color="auto" w:sz="4"/>
-              <w:bottom w:val="single" w:color="auto" w:sz="4"/>
-              <w:right w:val="single" w:color="auto" w:sz="4"/>
-            </w:tcBorders>
-            <w:shd w:fill="F0EBE2" w:val="clear"/>
-            <w:tcMar>
-              <w:top w:type="dxa" w:w="100"/>
-              <w:left w:type="dxa" w:w="120"/>
-              <w:bottom w:type="dxa" w:w="100"/>
-              <w:right w:type="dxa" w:w="120"/>
-            </w:tcMar>
-            <w:vAlign w:val="center"/>
-          </w:tcPr>
-          <w:p>
+            <w:shd w:fill="F0EBE2" w:val="clear"/>
+            <w:tcMar>
+              <w:top w:type="dxa" w:w="100"/>
+              <w:left w:type="dxa" w:w="120"/>
+              <w:bottom w:type="dxa" w:w="100"/>
+              <w:right w:type="dxa" w:w="120"/>
+            </w:tcMar>
+            <w:vAlign w:val="center"/>
+          </w:tcPr>
+          <w:p>
+            <w:pPr>
+              <w:jc w:val="left"/>
+            </w:pPr>
             <w:r>
               <w:rPr>
                 <w:rFonts w:ascii="Calibri" w:cs="Calibri" w:eastAsia="Calibri" w:hAnsi="Calibri"/>
@@ -1387,22 +1147,19 @@
         <w:tc>
           <w:tcPr>
             <w:tcW w:type="dxa" w:w="6200"/>
-            <w:tcBorders>
-              <w:top w:val="single" w:color="auto" w:sz="4"/>
-              <w:left w:val="single" w:color="auto" w:sz="4"/>
-              <w:bottom w:val="single" w:color="auto" w:sz="4"/>
-              <w:right w:val="single" w:color="auto" w:sz="4"/>
-            </w:tcBorders>
-            <w:shd w:fill="F0EBE2" w:val="clear"/>
-            <w:tcMar>
-              <w:top w:type="dxa" w:w="100"/>
-              <w:left w:type="dxa" w:w="120"/>
-              <w:bottom w:type="dxa" w:w="100"/>
-              <w:right w:type="dxa" w:w="120"/>
-            </w:tcMar>
-            <w:vAlign w:val="center"/>
-          </w:tcPr>
-          <w:p>
+            <w:shd w:fill="F0EBE2" w:val="clear"/>
+            <w:tcMar>
+              <w:top w:type="dxa" w:w="100"/>
+              <w:left w:type="dxa" w:w="120"/>
+              <w:bottom w:type="dxa" w:w="100"/>
+              <w:right w:type="dxa" w:w="120"/>
+            </w:tcMar>
+            <w:vAlign w:val="center"/>
+          </w:tcPr>
+          <w:p>
+            <w:pPr>
+              <w:jc w:val="left"/>
+            </w:pPr>
             <w:r>
               <w:rPr>
                 <w:rFonts w:ascii="Calibri" w:cs="Calibri" w:eastAsia="Calibri" w:hAnsi="Calibri"/>
@@ -1418,18 +1175,9 @@
         </w:tc>
       </w:tr>
       <w:tr>
-        <w:trPr>
-          <w:cantSplit/>
-        </w:trPr>
         <w:tc>
           <w:tcPr>
             <w:tcW w:type="dxa" w:w="2600"/>
-            <w:tcBorders>
-              <w:top w:val="single" w:color="auto" w:sz="4"/>
-              <w:left w:val="single" w:color="auto" w:sz="4"/>
-              <w:bottom w:val="single" w:color="auto" w:sz="4"/>
-              <w:right w:val="single" w:color="auto" w:sz="4"/>
-            </w:tcBorders>
             <w:shd w:fill="FFFFFF" w:val="clear"/>
             <w:tcMar>
               <w:top w:type="dxa" w:w="100"/>
@@ -1440,6 +1188,9 @@
             <w:vAlign w:val="center"/>
           </w:tcPr>
           <w:p>
+            <w:pPr>
+              <w:jc w:val="left"/>
+            </w:pPr>
             <w:r>
               <w:rPr>
                 <w:rFonts w:ascii="Calibri" w:cs="Calibri" w:eastAsia="Calibri" w:hAnsi="Calibri"/>
@@ -1456,12 +1207,6 @@
         <w:tc>
           <w:tcPr>
             <w:tcW w:type="dxa" w:w="6200"/>
-            <w:tcBorders>
-              <w:top w:val="single" w:color="auto" w:sz="4"/>
-              <w:left w:val="single" w:color="auto" w:sz="4"/>
-              <w:bottom w:val="single" w:color="auto" w:sz="4"/>
-              <w:right w:val="single" w:color="auto" w:sz="4"/>
-            </w:tcBorders>
             <w:shd w:fill="FFFFFF" w:val="clear"/>
             <w:tcMar>
               <w:top w:type="dxa" w:w="100"/>
@@ -1472,6 +1217,9 @@
             <w:vAlign w:val="center"/>
           </w:tcPr>
           <w:p>
+            <w:pPr>
+              <w:jc w:val="left"/>
+            </w:pPr>
             <w:r>
               <w:rPr>
                 <w:rFonts w:ascii="Calibri" w:cs="Calibri" w:eastAsia="Calibri" w:hAnsi="Calibri"/>
@@ -1487,28 +1235,22 @@
         </w:tc>
       </w:tr>
       <w:tr>
-        <w:trPr>
-          <w:cantSplit/>
-        </w:trPr>
         <w:tc>
           <w:tcPr>
             <w:tcW w:type="dxa" w:w="2600"/>
-            <w:tcBorders>
-              <w:top w:val="single" w:color="auto" w:sz="4"/>
-              <w:left w:val="single" w:color="auto" w:sz="4"/>
-              <w:bottom w:val="single" w:color="auto" w:sz="4"/>
-              <w:right w:val="single" w:color="auto" w:sz="4"/>
-            </w:tcBorders>
-            <w:shd w:fill="F0EBE2" w:val="clear"/>
-            <w:tcMar>
-              <w:top w:type="dxa" w:w="100"/>
-              <w:left w:type="dxa" w:w="120"/>
-              <w:bottom w:type="dxa" w:w="100"/>
-              <w:right w:type="dxa" w:w="120"/>
-            </w:tcMar>
-            <w:vAlign w:val="center"/>
-          </w:tcPr>
-          <w:p>
+            <w:shd w:fill="F0EBE2" w:val="clear"/>
+            <w:tcMar>
+              <w:top w:type="dxa" w:w="100"/>
+              <w:left w:type="dxa" w:w="120"/>
+              <w:bottom w:type="dxa" w:w="100"/>
+              <w:right w:type="dxa" w:w="120"/>
+            </w:tcMar>
+            <w:vAlign w:val="center"/>
+          </w:tcPr>
+          <w:p>
+            <w:pPr>
+              <w:jc w:val="left"/>
+            </w:pPr>
             <w:r>
               <w:rPr>
                 <w:rFonts w:ascii="Calibri" w:cs="Calibri" w:eastAsia="Calibri" w:hAnsi="Calibri"/>
@@ -1525,22 +1267,19 @@
         <w:tc>
           <w:tcPr>
             <w:tcW w:type="dxa" w:w="6200"/>
-            <w:tcBorders>
-              <w:top w:val="single" w:color="auto" w:sz="4"/>
-              <w:left w:val="single" w:color="auto" w:sz="4"/>
-              <w:bottom w:val="single" w:color="auto" w:sz="4"/>
-              <w:right w:val="single" w:color="auto" w:sz="4"/>
-            </w:tcBorders>
-            <w:shd w:fill="F0EBE2" w:val="clear"/>
-            <w:tcMar>
-              <w:top w:type="dxa" w:w="100"/>
-              <w:left w:type="dxa" w:w="120"/>
-              <w:bottom w:type="dxa" w:w="100"/>
-              <w:right w:type="dxa" w:w="120"/>
-            </w:tcMar>
-            <w:vAlign w:val="center"/>
-          </w:tcPr>
-          <w:p>
+            <w:shd w:fill="F0EBE2" w:val="clear"/>
+            <w:tcMar>
+              <w:top w:type="dxa" w:w="100"/>
+              <w:left w:type="dxa" w:w="120"/>
+              <w:bottom w:type="dxa" w:w="100"/>
+              <w:right w:type="dxa" w:w="120"/>
+            </w:tcMar>
+            <w:vAlign w:val="center"/>
+          </w:tcPr>
+          <w:p>
+            <w:pPr>
+              <w:jc w:val="left"/>
+            </w:pPr>
             <w:r>
               <w:rPr>
                 <w:rFonts w:ascii="Calibri" w:cs="Calibri" w:eastAsia="Calibri" w:hAnsi="Calibri"/>
@@ -1558,7 +1297,13 @@
     </w:tbl>
     <w:p>
       <w:pPr>
-        <w:spacing w:after="120" w:before="260"/>
+        <w:spacing w:after="160" w:before="160"/>
+      </w:pPr>
+    </w:p>
+    <w:p>
+      <w:pPr>
+        <w:pStyle w:val="Heading1"/>
+        <w:spacing w:after="160" w:before="320"/>
       </w:pPr>
       <w:r>
         <w:rPr>
@@ -1566,8 +1311,6 @@
           <w:b/>
           <w:bCs/>
           <w:color w:val="9B3D00"/>
-          <w:sz w:val="32"/>
-          <w:szCs w:val="32"/>
         </w:rPr>
         <w:t xml:space="preserve">5. Cronograma de implementación</w:t>
       </w:r>
@@ -1596,12 +1339,6 @@
         <w:tc>
           <w:tcPr>
             <w:tcW w:type="dxa" w:w="1600"/>
-            <w:tcBorders>
-              <w:top w:val="single" w:color="auto" w:sz="4"/>
-              <w:left w:val="single" w:color="auto" w:sz="4"/>
-              <w:bottom w:val="single" w:color="auto" w:sz="4"/>
-              <w:right w:val="single" w:color="auto" w:sz="4"/>
-            </w:tcBorders>
             <w:shd w:fill="9B3D00" w:val="clear"/>
             <w:tcMar>
               <w:top w:type="dxa" w:w="100"/>
@@ -1612,6 +1349,9 @@
             <w:vAlign w:val="center"/>
           </w:tcPr>
           <w:p>
+            <w:pPr>
+              <w:jc w:val="left"/>
+            </w:pPr>
             <w:r>
               <w:rPr>
                 <w:rFonts w:ascii="Calibri" w:cs="Calibri" w:eastAsia="Calibri" w:hAnsi="Calibri"/>
@@ -1628,12 +1368,6 @@
         <w:tc>
           <w:tcPr>
             <w:tcW w:type="dxa" w:w="2300"/>
-            <w:tcBorders>
-              <w:top w:val="single" w:color="auto" w:sz="4"/>
-              <w:left w:val="single" w:color="auto" w:sz="4"/>
-              <w:bottom w:val="single" w:color="auto" w:sz="4"/>
-              <w:right w:val="single" w:color="auto" w:sz="4"/>
-            </w:tcBorders>
             <w:shd w:fill="9B3D00" w:val="clear"/>
             <w:tcMar>
               <w:top w:type="dxa" w:w="100"/>
@@ -1644,6 +1378,9 @@
             <w:vAlign w:val="center"/>
           </w:tcPr>
           <w:p>
+            <w:pPr>
+              <w:jc w:val="left"/>
+            </w:pPr>
             <w:r>
               <w:rPr>
                 <w:rFonts w:ascii="Calibri" w:cs="Calibri" w:eastAsia="Calibri" w:hAnsi="Calibri"/>
@@ -1660,12 +1397,6 @@
         <w:tc>
           <w:tcPr>
             <w:tcW w:type="dxa" w:w="4900"/>
-            <w:tcBorders>
-              <w:top w:val="single" w:color="auto" w:sz="4"/>
-              <w:left w:val="single" w:color="auto" w:sz="4"/>
-              <w:bottom w:val="single" w:color="auto" w:sz="4"/>
-              <w:right w:val="single" w:color="auto" w:sz="4"/>
-            </w:tcBorders>
             <w:shd w:fill="9B3D00" w:val="clear"/>
             <w:tcMar>
               <w:top w:type="dxa" w:w="100"/>
@@ -1676,6 +1407,9 @@
             <w:vAlign w:val="center"/>
           </w:tcPr>
           <w:p>
+            <w:pPr>
+              <w:jc w:val="left"/>
+            </w:pPr>
             <w:r>
               <w:rPr>
                 <w:rFonts w:ascii="Calibri" w:cs="Calibri" w:eastAsia="Calibri" w:hAnsi="Calibri"/>
@@ -1691,28 +1425,51 @@
         </w:tc>
       </w:tr>
       <w:tr>
-        <w:trPr>
-          <w:cantSplit/>
-        </w:trPr>
         <w:tc>
           <w:tcPr>
             <w:tcW w:type="dxa" w:w="1600"/>
-            <w:tcBorders>
-              <w:top w:val="single" w:color="auto" w:sz="4"/>
-              <w:left w:val="single" w:color="auto" w:sz="4"/>
-              <w:bottom w:val="single" w:color="auto" w:sz="4"/>
-              <w:right w:val="single" w:color="auto" w:sz="4"/>
-            </w:tcBorders>
-            <w:shd w:fill="F0EBE2" w:val="clear"/>
-            <w:tcMar>
-              <w:top w:type="dxa" w:w="100"/>
-              <w:left w:type="dxa" w:w="120"/>
-              <w:bottom w:type="dxa" w:w="100"/>
-              <w:right w:type="dxa" w:w="120"/>
-            </w:tcMar>
-            <w:vAlign w:val="center"/>
-          </w:tcPr>
-          <w:p>
+            <w:shd w:fill="F0EBE2" w:val="clear"/>
+            <w:tcMar>
+              <w:top w:type="dxa" w:w="100"/>
+              <w:left w:type="dxa" w:w="120"/>
+              <w:bottom w:type="dxa" w:w="100"/>
+              <w:right w:type="dxa" w:w="120"/>
+            </w:tcMar>
+            <w:vAlign w:val="center"/>
+          </w:tcPr>
+          <w:p>
+            <w:pPr>
+              <w:jc w:val="left"/>
+            </w:pPr>
+            <w:r>
+              <w:rPr>
+                <w:rFonts w:ascii="Calibri" w:cs="Calibri" w:eastAsia="Calibri" w:hAnsi="Calibri"/>
+                <w:b w:val="false"/>
+                <w:bCs w:val="false"/>
+                <w:color w:val="2A1D12"/>
+                <w:sz w:val="20"/>
+                <w:szCs w:val="20"/>
+              </w:rPr>
+              <w:t xml:space="preserve">16/9</w:t>
+            </w:r>
+          </w:p>
+        </w:tc>
+        <w:tc>
+          <w:tcPr>
+            <w:tcW w:type="dxa" w:w="2300"/>
+            <w:shd w:fill="F0EBE2" w:val="clear"/>
+            <w:tcMar>
+              <w:top w:type="dxa" w:w="100"/>
+              <w:left w:type="dxa" w:w="120"/>
+              <w:bottom w:type="dxa" w:w="100"/>
+              <w:right w:type="dxa" w:w="120"/>
+            </w:tcMar>
+            <w:vAlign w:val="center"/>
+          </w:tcPr>
+          <w:p>
+            <w:pPr>
+              <w:jc w:val="left"/>
+            </w:pPr>
             <w:r>
               <w:rPr>
                 <w:rFonts w:ascii="Calibri" w:cs="Calibri" w:eastAsia="Calibri" w:hAnsi="Calibri"/>
@@ -1722,38 +1479,6 @@
                 <w:sz w:val="20"/>
                 <w:szCs w:val="20"/>
               </w:rPr>
-              <w:t xml:space="preserve">16/9</w:t>
-            </w:r>
-          </w:p>
-        </w:tc>
-        <w:tc>
-          <w:tcPr>
-            <w:tcW w:type="dxa" w:w="2300"/>
-            <w:tcBorders>
-              <w:top w:val="single" w:color="auto" w:sz="4"/>
-              <w:left w:val="single" w:color="auto" w:sz="4"/>
-              <w:bottom w:val="single" w:color="auto" w:sz="4"/>
-              <w:right w:val="single" w:color="auto" w:sz="4"/>
-            </w:tcBorders>
-            <w:shd w:fill="F0EBE2" w:val="clear"/>
-            <w:tcMar>
-              <w:top w:type="dxa" w:w="100"/>
-              <w:left w:type="dxa" w:w="120"/>
-              <w:bottom w:type="dxa" w:w="100"/>
-              <w:right w:type="dxa" w:w="120"/>
-            </w:tcMar>
-            <w:vAlign w:val="center"/>
-          </w:tcPr>
-          <w:p>
-            <w:r>
-              <w:rPr>
-                <w:rFonts w:ascii="Calibri" w:cs="Calibri" w:eastAsia="Calibri" w:hAnsi="Calibri"/>
-                <w:b w:val="false"/>
-                <w:bCs w:val="false"/>
-                <w:color w:val="2A1D12"/>
-                <w:sz w:val="20"/>
-                <w:szCs w:val="20"/>
-              </w:rPr>
               <w:t xml:space="preserve">Reunión con equipos directivos</w:t>
             </w:r>
           </w:p>
@@ -1761,22 +1486,19 @@
         <w:tc>
           <w:tcPr>
             <w:tcW w:type="dxa" w:w="4900"/>
-            <w:tcBorders>
-              <w:top w:val="single" w:color="auto" w:sz="4"/>
-              <w:left w:val="single" w:color="auto" w:sz="4"/>
-              <w:bottom w:val="single" w:color="auto" w:sz="4"/>
-              <w:right w:val="single" w:color="auto" w:sz="4"/>
-            </w:tcBorders>
-            <w:shd w:fill="F0EBE2" w:val="clear"/>
-            <w:tcMar>
-              <w:top w:type="dxa" w:w="100"/>
-              <w:left w:type="dxa" w:w="120"/>
-              <w:bottom w:type="dxa" w:w="100"/>
-              <w:right w:type="dxa" w:w="120"/>
-            </w:tcMar>
-            <w:vAlign w:val="center"/>
-          </w:tcPr>
-          <w:p>
+            <w:shd w:fill="F0EBE2" w:val="clear"/>
+            <w:tcMar>
+              <w:top w:type="dxa" w:w="100"/>
+              <w:left w:type="dxa" w:w="120"/>
+              <w:bottom w:type="dxa" w:w="100"/>
+              <w:right w:type="dxa" w:w="120"/>
+            </w:tcMar>
+            <w:vAlign w:val="center"/>
+          </w:tcPr>
+          <w:p>
+            <w:pPr>
+              <w:jc w:val="left"/>
+            </w:pPr>
             <w:r>
               <w:rPr>
                 <w:rFonts w:ascii="Calibri" w:cs="Calibri" w:eastAsia="Calibri" w:hAnsi="Calibri"/>
@@ -1792,18 +1514,9 @@
         </w:tc>
       </w:tr>
       <w:tr>
-        <w:trPr>
-          <w:cantSplit/>
-        </w:trPr>
         <w:tc>
           <w:tcPr>
             <w:tcW w:type="dxa" w:w="1600"/>
-            <w:tcBorders>
-              <w:top w:val="single" w:color="auto" w:sz="4"/>
-              <w:left w:val="single" w:color="auto" w:sz="4"/>
-              <w:bottom w:val="single" w:color="auto" w:sz="4"/>
-              <w:right w:val="single" w:color="auto" w:sz="4"/>
-            </w:tcBorders>
             <w:shd w:fill="FFFFFF" w:val="clear"/>
             <w:tcMar>
               <w:top w:type="dxa" w:w="100"/>
@@ -1814,6 +1527,38 @@
             <w:vAlign w:val="center"/>
           </w:tcPr>
           <w:p>
+            <w:pPr>
+              <w:jc w:val="left"/>
+            </w:pPr>
+            <w:r>
+              <w:rPr>
+                <w:rFonts w:ascii="Calibri" w:cs="Calibri" w:eastAsia="Calibri" w:hAnsi="Calibri"/>
+                <w:b w:val="false"/>
+                <w:bCs w:val="false"/>
+                <w:color w:val="2A1D12"/>
+                <w:sz w:val="20"/>
+                <w:szCs w:val="20"/>
+              </w:rPr>
+              <w:t xml:space="preserve">Próximas semanas</w:t>
+            </w:r>
+          </w:p>
+        </w:tc>
+        <w:tc>
+          <w:tcPr>
+            <w:tcW w:type="dxa" w:w="2300"/>
+            <w:shd w:fill="FFFFFF" w:val="clear"/>
+            <w:tcMar>
+              <w:top w:type="dxa" w:w="100"/>
+              <w:left w:type="dxa" w:w="120"/>
+              <w:bottom w:type="dxa" w:w="100"/>
+              <w:right w:type="dxa" w:w="120"/>
+            </w:tcMar>
+            <w:vAlign w:val="center"/>
+          </w:tcPr>
+          <w:p>
+            <w:pPr>
+              <w:jc w:val="left"/>
+            </w:pPr>
             <w:r>
               <w:rPr>
                 <w:rFonts w:ascii="Calibri" w:cs="Calibri" w:eastAsia="Calibri" w:hAnsi="Calibri"/>
@@ -1823,19 +1568,13 @@
                 <w:sz w:val="20"/>
                 <w:szCs w:val="20"/>
               </w:rPr>
-              <w:t xml:space="preserve">Próximas semanas</w:t>
-            </w:r>
-          </w:p>
-        </w:tc>
-        <w:tc>
-          <w:tcPr>
-            <w:tcW w:type="dxa" w:w="2300"/>
-            <w:tcBorders>
-              <w:top w:val="single" w:color="auto" w:sz="4"/>
-              <w:left w:val="single" w:color="auto" w:sz="4"/>
-              <w:bottom w:val="single" w:color="auto" w:sz="4"/>
-              <w:right w:val="single" w:color="auto" w:sz="4"/>
-            </w:tcBorders>
+              <w:t xml:space="preserve">Relevamiento en sitio</w:t>
+            </w:r>
+          </w:p>
+        </w:tc>
+        <w:tc>
+          <w:tcPr>
+            <w:tcW w:type="dxa" w:w="4900"/>
             <w:shd w:fill="FFFFFF" w:val="clear"/>
             <w:tcMar>
               <w:top w:type="dxa" w:w="100"/>
@@ -1846,38 +1585,9 @@
             <w:vAlign w:val="center"/>
           </w:tcPr>
           <w:p>
-            <w:r>
-              <w:rPr>
-                <w:rFonts w:ascii="Calibri" w:cs="Calibri" w:eastAsia="Calibri" w:hAnsi="Calibri"/>
-                <w:b w:val="false"/>
-                <w:bCs w:val="false"/>
-                <w:color w:val="2A1D12"/>
-                <w:sz w:val="20"/>
-                <w:szCs w:val="20"/>
-              </w:rPr>
-              <w:t xml:space="preserve">Relevamiento en sitio</w:t>
-            </w:r>
-          </w:p>
-        </w:tc>
-        <w:tc>
-          <w:tcPr>
-            <w:tcW w:type="dxa" w:w="4900"/>
-            <w:tcBorders>
-              <w:top w:val="single" w:color="auto" w:sz="4"/>
-              <w:left w:val="single" w:color="auto" w:sz="4"/>
-              <w:bottom w:val="single" w:color="auto" w:sz="4"/>
-              <w:right w:val="single" w:color="auto" w:sz="4"/>
-            </w:tcBorders>
-            <w:shd w:fill="FFFFFF" w:val="clear"/>
-            <w:tcMar>
-              <w:top w:type="dxa" w:w="100"/>
-              <w:left w:type="dxa" w:w="120"/>
-              <w:bottom w:type="dxa" w:w="100"/>
-              <w:right w:type="dxa" w:w="120"/>
-            </w:tcMar>
-            <w:vAlign w:val="center"/>
-          </w:tcPr>
-          <w:p>
+            <w:pPr>
+              <w:jc w:val="left"/>
+            </w:pPr>
             <w:r>
               <w:rPr>
                 <w:rFonts w:ascii="Calibri" w:cs="Calibri" w:eastAsia="Calibri" w:hAnsi="Calibri"/>
@@ -1893,28 +1603,51 @@
         </w:tc>
       </w:tr>
       <w:tr>
-        <w:trPr>
-          <w:cantSplit/>
-        </w:trPr>
         <w:tc>
           <w:tcPr>
             <w:tcW w:type="dxa" w:w="1600"/>
-            <w:tcBorders>
-              <w:top w:val="single" w:color="auto" w:sz="4"/>
-              <w:left w:val="single" w:color="auto" w:sz="4"/>
-              <w:bottom w:val="single" w:color="auto" w:sz="4"/>
-              <w:right w:val="single" w:color="auto" w:sz="4"/>
-            </w:tcBorders>
-            <w:shd w:fill="F0EBE2" w:val="clear"/>
-            <w:tcMar>
-              <w:top w:type="dxa" w:w="100"/>
-              <w:left w:type="dxa" w:w="120"/>
-              <w:bottom w:type="dxa" w:w="100"/>
-              <w:right w:type="dxa" w:w="120"/>
-            </w:tcMar>
-            <w:vAlign w:val="center"/>
-          </w:tcPr>
-          <w:p>
+            <w:shd w:fill="F0EBE2" w:val="clear"/>
+            <w:tcMar>
+              <w:top w:type="dxa" w:w="100"/>
+              <w:left w:type="dxa" w:w="120"/>
+              <w:bottom w:type="dxa" w:w="100"/>
+              <w:right w:type="dxa" w:w="120"/>
+            </w:tcMar>
+            <w:vAlign w:val="center"/>
+          </w:tcPr>
+          <w:p>
+            <w:pPr>
+              <w:jc w:val="left"/>
+            </w:pPr>
+            <w:r>
+              <w:rPr>
+                <w:rFonts w:ascii="Calibri" w:cs="Calibri" w:eastAsia="Calibri" w:hAnsi="Calibri"/>
+                <w:b w:val="false"/>
+                <w:bCs w:val="false"/>
+                <w:color w:val="2A1D12"/>
+                <w:sz w:val="20"/>
+                <w:szCs w:val="20"/>
+              </w:rPr>
+              <w:t xml:space="preserve">Tras el relevamiento</w:t>
+            </w:r>
+          </w:p>
+        </w:tc>
+        <w:tc>
+          <w:tcPr>
+            <w:tcW w:type="dxa" w:w="2300"/>
+            <w:shd w:fill="F0EBE2" w:val="clear"/>
+            <w:tcMar>
+              <w:top w:type="dxa" w:w="100"/>
+              <w:left w:type="dxa" w:w="120"/>
+              <w:bottom w:type="dxa" w:w="100"/>
+              <w:right w:type="dxa" w:w="120"/>
+            </w:tcMar>
+            <w:vAlign w:val="center"/>
+          </w:tcPr>
+          <w:p>
+            <w:pPr>
+              <w:jc w:val="left"/>
+            </w:pPr>
             <w:r>
               <w:rPr>
                 <w:rFonts w:ascii="Calibri" w:cs="Calibri" w:eastAsia="Calibri" w:hAnsi="Calibri"/>
@@ -1924,38 +1657,6 @@
                 <w:sz w:val="20"/>
                 <w:szCs w:val="20"/>
               </w:rPr>
-              <w:t xml:space="preserve">Tras el relevamiento</w:t>
-            </w:r>
-          </w:p>
-        </w:tc>
-        <w:tc>
-          <w:tcPr>
-            <w:tcW w:type="dxa" w:w="2300"/>
-            <w:tcBorders>
-              <w:top w:val="single" w:color="auto" w:sz="4"/>
-              <w:left w:val="single" w:color="auto" w:sz="4"/>
-              <w:bottom w:val="single" w:color="auto" w:sz="4"/>
-              <w:right w:val="single" w:color="auto" w:sz="4"/>
-            </w:tcBorders>
-            <w:shd w:fill="F0EBE2" w:val="clear"/>
-            <w:tcMar>
-              <w:top w:type="dxa" w:w="100"/>
-              <w:left w:type="dxa" w:w="120"/>
-              <w:bottom w:type="dxa" w:w="100"/>
-              <w:right w:type="dxa" w:w="120"/>
-            </w:tcMar>
-            <w:vAlign w:val="center"/>
-          </w:tcPr>
-          <w:p>
-            <w:r>
-              <w:rPr>
-                <w:rFonts w:ascii="Calibri" w:cs="Calibri" w:eastAsia="Calibri" w:hAnsi="Calibri"/>
-                <w:b w:val="false"/>
-                <w:bCs w:val="false"/>
-                <w:color w:val="2A1D12"/>
-                <w:sz w:val="20"/>
-                <w:szCs w:val="20"/>
-              </w:rPr>
               <w:t xml:space="preserve">Instalación y calibración</w:t>
             </w:r>
           </w:p>
@@ -1963,22 +1664,19 @@
         <w:tc>
           <w:tcPr>
             <w:tcW w:type="dxa" w:w="4900"/>
-            <w:tcBorders>
-              <w:top w:val="single" w:color="auto" w:sz="4"/>
-              <w:left w:val="single" w:color="auto" w:sz="4"/>
-              <w:bottom w:val="single" w:color="auto" w:sz="4"/>
-              <w:right w:val="single" w:color="auto" w:sz="4"/>
-            </w:tcBorders>
-            <w:shd w:fill="F0EBE2" w:val="clear"/>
-            <w:tcMar>
-              <w:top w:type="dxa" w:w="100"/>
-              <w:left w:type="dxa" w:w="120"/>
-              <w:bottom w:type="dxa" w:w="100"/>
-              <w:right w:type="dxa" w:w="120"/>
-            </w:tcMar>
-            <w:vAlign w:val="center"/>
-          </w:tcPr>
-          <w:p>
+            <w:shd w:fill="F0EBE2" w:val="clear"/>
+            <w:tcMar>
+              <w:top w:type="dxa" w:w="100"/>
+              <w:left w:type="dxa" w:w="120"/>
+              <w:bottom w:type="dxa" w:w="100"/>
+              <w:right w:type="dxa" w:w="120"/>
+            </w:tcMar>
+            <w:vAlign w:val="center"/>
+          </w:tcPr>
+          <w:p>
+            <w:pPr>
+              <w:jc w:val="left"/>
+            </w:pPr>
             <w:r>
               <w:rPr>
                 <w:rFonts w:ascii="Calibri" w:cs="Calibri" w:eastAsia="Calibri" w:hAnsi="Calibri"/>
@@ -1994,18 +1692,9 @@
         </w:tc>
       </w:tr>
       <w:tr>
-        <w:trPr>
-          <w:cantSplit/>
-        </w:trPr>
         <w:tc>
           <w:tcPr>
             <w:tcW w:type="dxa" w:w="1600"/>
-            <w:tcBorders>
-              <w:top w:val="single" w:color="auto" w:sz="4"/>
-              <w:left w:val="single" w:color="auto" w:sz="4"/>
-              <w:bottom w:val="single" w:color="auto" w:sz="4"/>
-              <w:right w:val="single" w:color="auto" w:sz="4"/>
-            </w:tcBorders>
             <w:shd w:fill="FFFFFF" w:val="clear"/>
             <w:tcMar>
               <w:top w:type="dxa" w:w="100"/>
@@ -2016,6 +1705,38 @@
             <w:vAlign w:val="center"/>
           </w:tcPr>
           <w:p>
+            <w:pPr>
+              <w:jc w:val="left"/>
+            </w:pPr>
+            <w:r>
+              <w:rPr>
+                <w:rFonts w:ascii="Calibri" w:cs="Calibri" w:eastAsia="Calibri" w:hAnsi="Calibri"/>
+                <w:b w:val="false"/>
+                <w:bCs w:val="false"/>
+                <w:color w:val="2A1D12"/>
+                <w:sz w:val="20"/>
+                <w:szCs w:val="20"/>
+              </w:rPr>
+              <w:t xml:space="preserve">Meta</w:t>
+            </w:r>
+          </w:p>
+        </w:tc>
+        <w:tc>
+          <w:tcPr>
+            <w:tcW w:type="dxa" w:w="2300"/>
+            <w:shd w:fill="FFFFFF" w:val="clear"/>
+            <w:tcMar>
+              <w:top w:type="dxa" w:w="100"/>
+              <w:left w:type="dxa" w:w="120"/>
+              <w:bottom w:type="dxa" w:w="100"/>
+              <w:right w:type="dxa" w:w="120"/>
+            </w:tcMar>
+            <w:vAlign w:val="center"/>
+          </w:tcPr>
+          <w:p>
+            <w:pPr>
+              <w:jc w:val="left"/>
+            </w:pPr>
             <w:r>
               <w:rPr>
                 <w:rFonts w:ascii="Calibri" w:cs="Calibri" w:eastAsia="Calibri" w:hAnsi="Calibri"/>
@@ -2025,19 +1746,13 @@
                 <w:sz w:val="20"/>
                 <w:szCs w:val="20"/>
               </w:rPr>
-              <w:t xml:space="preserve">Meta</w:t>
-            </w:r>
-          </w:p>
-        </w:tc>
-        <w:tc>
-          <w:tcPr>
-            <w:tcW w:type="dxa" w:w="2300"/>
-            <w:tcBorders>
-              <w:top w:val="single" w:color="auto" w:sz="4"/>
-              <w:left w:val="single" w:color="auto" w:sz="4"/>
-              <w:bottom w:val="single" w:color="auto" w:sz="4"/>
-              <w:right w:val="single" w:color="auto" w:sz="4"/>
-            </w:tcBorders>
+              <w:t xml:space="preserve">Datos en vivo</w:t>
+            </w:r>
+          </w:p>
+        </w:tc>
+        <w:tc>
+          <w:tcPr>
+            <w:tcW w:type="dxa" w:w="4900"/>
             <w:shd w:fill="FFFFFF" w:val="clear"/>
             <w:tcMar>
               <w:top w:type="dxa" w:w="100"/>
@@ -2048,38 +1763,9 @@
             <w:vAlign w:val="center"/>
           </w:tcPr>
           <w:p>
-            <w:r>
-              <w:rPr>
-                <w:rFonts w:ascii="Calibri" w:cs="Calibri" w:eastAsia="Calibri" w:hAnsi="Calibri"/>
-                <w:b w:val="false"/>
-                <w:bCs w:val="false"/>
-                <w:color w:val="2A1D12"/>
-                <w:sz w:val="20"/>
-                <w:szCs w:val="20"/>
-              </w:rPr>
-              <w:t xml:space="preserve">Datos en vivo</w:t>
-            </w:r>
-          </w:p>
-        </w:tc>
-        <w:tc>
-          <w:tcPr>
-            <w:tcW w:type="dxa" w:w="4900"/>
-            <w:tcBorders>
-              <w:top w:val="single" w:color="auto" w:sz="4"/>
-              <w:left w:val="single" w:color="auto" w:sz="4"/>
-              <w:bottom w:val="single" w:color="auto" w:sz="4"/>
-              <w:right w:val="single" w:color="auto" w:sz="4"/>
-            </w:tcBorders>
-            <w:shd w:fill="FFFFFF" w:val="clear"/>
-            <w:tcMar>
-              <w:top w:type="dxa" w:w="100"/>
-              <w:left w:type="dxa" w:w="120"/>
-              <w:bottom w:type="dxa" w:w="100"/>
-              <w:right w:type="dxa" w:w="120"/>
-            </w:tcMar>
-            <w:vAlign w:val="center"/>
-          </w:tcPr>
-          <w:p>
+            <w:pPr>
+              <w:jc w:val="left"/>
+            </w:pPr>
             <w:r>
               <w:rPr>
                 <w:rFonts w:ascii="Calibri" w:cs="Calibri" w:eastAsia="Calibri" w:hAnsi="Calibri"/>
@@ -2097,7 +1783,13 @@
     </w:tbl>
     <w:p>
       <w:pPr>
-        <w:spacing w:after="120" w:before="260"/>
+        <w:spacing w:after="160" w:before="160"/>
+      </w:pPr>
+    </w:p>
+    <w:p>
+      <w:pPr>
+        <w:pStyle w:val="Heading1"/>
+        <w:spacing w:after="160" w:before="320"/>
       </w:pPr>
       <w:r>
         <w:rPr>
@@ -2105,8 +1797,6 @@
           <w:b/>
           <w:bCs/>
           <w:color w:val="9B3D00"/>
-          <w:sz w:val="32"/>
-          <w:szCs w:val="32"/>
         </w:rPr>
         <w:t xml:space="preserve">6. Próximos pasos y contacto</w:t>
       </w:r>
@@ -2116,13 +1806,15 @@
         <w:pStyle w:val="ListParagraph"/>
         <w:numPr>
           <w:ilvl w:val="0"/>
-          <w:numId w:val="1"/>
+          <w:numId w:val="2"/>
         </w:numPr>
-        <w:spacing w:after="80"/>
+        <w:spacing w:after="120" w:line="276"/>
       </w:pPr>
       <w:r>
         <w:rPr>
           <w:rFonts w:ascii="Calibri" w:cs="Calibri" w:eastAsia="Calibri" w:hAnsi="Calibri"/>
+          <w:b w:val="false"/>
+          <w:bCs w:val="false"/>
           <w:color w:val="2A1D12"/>
           <w:sz w:val="22"/>
           <w:szCs w:val="22"/>
@@ -2135,13 +1827,15 @@
         <w:pStyle w:val="ListParagraph"/>
         <w:numPr>
           <w:ilvl w:val="0"/>
-          <w:numId w:val="1"/>
+          <w:numId w:val="2"/>
         </w:numPr>
-        <w:spacing w:after="80"/>
+        <w:spacing w:after="120" w:line="276"/>
       </w:pPr>
       <w:r>
         <w:rPr>
           <w:rFonts w:ascii="Calibri" w:cs="Calibri" w:eastAsia="Calibri" w:hAnsi="Calibri"/>
+          <w:b w:val="false"/>
+          <w:bCs w:val="false"/>
           <w:color w:val="2A1D12"/>
           <w:sz w:val="22"/>
           <w:szCs w:val="22"/>
@@ -2154,13 +1848,15 @@
         <w:pStyle w:val="ListParagraph"/>
         <w:numPr>
           <w:ilvl w:val="0"/>
-          <w:numId w:val="1"/>
+          <w:numId w:val="2"/>
         </w:numPr>
-        <w:spacing w:after="80"/>
+        <w:spacing w:after="120" w:line="276"/>
       </w:pPr>
       <w:r>
         <w:rPr>
           <w:rFonts w:ascii="Calibri" w:cs="Calibri" w:eastAsia="Calibri" w:hAnsi="Calibri"/>
+          <w:b w:val="false"/>
+          <w:bCs w:val="false"/>
           <w:color w:val="2A1D12"/>
           <w:sz w:val="22"/>
           <w:szCs w:val="22"/>
@@ -2171,9 +1867,9 @@
     <w:p>
       <w:pPr>
         <w:pBdr>
-          <w:top w:val="single" w:color="D8CFC2" w:sz="4"/>
+          <w:top w:val="single" w:color="D8CFC2" w:sz="6" w:space="8"/>
         </w:pBdr>
-        <w:spacing w:before="300"/>
+        <w:spacing w:before="400"/>
       </w:pPr>
       <w:r>
         <w:rPr>
@@ -2361,8 +2057,26 @@
       </w:pPr>
     </w:lvl>
   </w:abstractNum>
+  <w:abstractNum w:abstractNumId="2" w15:restartNumberingAfterBreak="0">
+    <w:multiLevelType w:val="hybridMultilevel"/>
+    <w:lvl w:ilvl="0" w15:tentative="1">
+      <w:start w:val="1"/>
+      <w:numFmt w:val="bullet"/>
+      <w:lvlText w:val="•"/>
+      <w:lvlJc w:val="left"/>
+      <w:pPr>
+        <w:ind w:left="360" w:hanging="260"/>
+      </w:pPr>
+    </w:lvl>
+  </w:abstractNum>
   <w:num w:numId="1">
     <w:abstractNumId w:val="1"/>
+    <w:lvlOverride w:ilvl="0">
+      <w:startOverride w:val="1"/>
+    </w:lvlOverride>
+  </w:num>
+  <w:num w:numId="2">
+    <w:abstractNumId w:val="2"/>
     <w:lvlOverride w:ilvl="0">
       <w:startOverride w:val="1"/>
     </w:lvlOverride>

</xml_diff>

<commit_message>
docs: correcciones finales menores
</commit_message>
<xml_diff>
--- a/docs/plan_despliegue.docx
+++ b/docs/plan_despliegue.docx
@@ -31,8 +31,21 @@
           <w:sz w:val="34"/>
           <w:szCs w:val="34"/>
         </w:rPr>
-        <w:t>Plan de despliegue — Fase 2: Saladillo y 25 de Mayo</w:t>
-      </w:r>
+        <w:t xml:space="preserve">Plan de despliegue — Fase 2: Saladillo y 25 de </w:t>
+      </w:r>
+      <w:proofErr w:type="gramStart"/>
+      <w:r>
+        <w:rPr>
+          <w:rFonts w:ascii="Calibri" w:eastAsia="Calibri" w:hAnsi="Calibri" w:cs="Calibri"/>
+          <w:b/>
+          <w:bCs/>
+          <w:color w:val="9B3D00"/>
+          <w:sz w:val="34"/>
+          <w:szCs w:val="34"/>
+        </w:rPr>
+        <w:t>Mayo</w:t>
+      </w:r>
+      <w:proofErr w:type="gramEnd"/>
     </w:p>
     <w:p>
       <w:pPr>
@@ -90,7 +103,27 @@
           <w:sz w:val="22"/>
           <w:szCs w:val="22"/>
         </w:rPr>
-        <w:t>Es la segunda etapa de la red de monitoreo de calidad del aire que ya opera en escuelas de Saladillo (aq.lemeit.ar) — la primera con escuelas propias fuera del distrito, sumando el partido de 25 de Mayo.</w:t>
+        <w:t xml:space="preserve">Es la segunda etapa de la red de monitoreo de calidad del aire que ya opera en escuelas de Saladillo (aq.lemeit.ar) — la primera con escuelas propias fuera del distrito, sumando el partido de 25 de </w:t>
+      </w:r>
+      <w:proofErr w:type="gramStart"/>
+      <w:r>
+        <w:rPr>
+          <w:rFonts w:ascii="Calibri" w:eastAsia="Calibri" w:hAnsi="Calibri" w:cs="Calibri"/>
+          <w:color w:val="2A1D12"/>
+          <w:sz w:val="22"/>
+          <w:szCs w:val="22"/>
+        </w:rPr>
+        <w:t>Mayo</w:t>
+      </w:r>
+      <w:proofErr w:type="gramEnd"/>
+      <w:r>
+        <w:rPr>
+          <w:rFonts w:ascii="Calibri" w:eastAsia="Calibri" w:hAnsi="Calibri" w:cs="Calibri"/>
+          <w:color w:val="2A1D12"/>
+          <w:sz w:val="22"/>
+          <w:szCs w:val="22"/>
+        </w:rPr>
+        <w:t>.</w:t>
       </w:r>
     </w:p>
     <w:p>
@@ -121,7 +154,27 @@
           <w:sz w:val="22"/>
           <w:szCs w:val="22"/>
         </w:rPr>
-        <w:t>Selección: 4 escuelas confirmadas y 1 en proceso de reubicación (Colegio Secundario Madre Teresa) — 3 en Saladillo y 2 en el partido de 25 de Mayo, cubriendo en ambos partidos al menos una zona urbana y una rural.</w:t>
+        <w:t xml:space="preserve">Selección: 4 escuelas confirmadas y 1 en proceso de reubicación (Colegio Secundario Madre Teresa) — 3 en Saladillo y 2 en el partido de 25 de </w:t>
+      </w:r>
+      <w:proofErr w:type="gramStart"/>
+      <w:r>
+        <w:rPr>
+          <w:rFonts w:ascii="Calibri" w:eastAsia="Calibri" w:hAnsi="Calibri" w:cs="Calibri"/>
+          <w:color w:val="2A1D12"/>
+          <w:sz w:val="22"/>
+          <w:szCs w:val="22"/>
+        </w:rPr>
+        <w:t>Mayo</w:t>
+      </w:r>
+      <w:proofErr w:type="gramEnd"/>
+      <w:r>
+        <w:rPr>
+          <w:rFonts w:ascii="Calibri" w:eastAsia="Calibri" w:hAnsi="Calibri" w:cs="Calibri"/>
+          <w:color w:val="2A1D12"/>
+          <w:sz w:val="22"/>
+          <w:szCs w:val="22"/>
+        </w:rPr>
+        <w:t>, cubriendo en ambos partidos al menos una zona urbana y una rural.</w:t>
       </w:r>
     </w:p>
     <w:tbl>
@@ -148,12 +201,6 @@
         <w:gridCol w:w="2700"/>
       </w:tblGrid>
       <w:tr>
-        <w:tblPrEx>
-          <w:tblCellMar>
-            <w:top w:w="0" w:type="dxa"/>
-            <w:bottom w:w="0" w:type="dxa"/>
-          </w:tblCellMar>
-        </w:tblPrEx>
         <w:trPr>
           <w:tblHeader/>
         </w:trPr>
@@ -263,12 +310,6 @@
         </w:tc>
       </w:tr>
       <w:tr>
-        <w:tblPrEx>
-          <w:tblCellMar>
-            <w:top w:w="0" w:type="dxa"/>
-            <w:bottom w:w="0" w:type="dxa"/>
-          </w:tblCellMar>
-        </w:tblPrEx>
         <w:tc>
           <w:tcPr>
             <w:tcW w:w="3100" w:type="dxa"/>
@@ -361,12 +402,6 @@
         </w:tc>
       </w:tr>
       <w:tr>
-        <w:tblPrEx>
-          <w:tblCellMar>
-            <w:top w:w="0" w:type="dxa"/>
-            <w:bottom w:w="0" w:type="dxa"/>
-          </w:tblCellMar>
-        </w:tblPrEx>
         <w:tc>
           <w:tcPr>
             <w:tcW w:w="3100" w:type="dxa"/>
@@ -459,12 +494,6 @@
         </w:tc>
       </w:tr>
       <w:tr>
-        <w:tblPrEx>
-          <w:tblCellMar>
-            <w:top w:w="0" w:type="dxa"/>
-            <w:bottom w:w="0" w:type="dxa"/>
-          </w:tblCellMar>
-        </w:tblPrEx>
         <w:tc>
           <w:tcPr>
             <w:tcW w:w="3100" w:type="dxa"/>
@@ -557,12 +586,6 @@
         </w:tc>
       </w:tr>
       <w:tr>
-        <w:tblPrEx>
-          <w:tblCellMar>
-            <w:top w:w="0" w:type="dxa"/>
-            <w:bottom w:w="0" w:type="dxa"/>
-          </w:tblCellMar>
-        </w:tblPrEx>
         <w:tc>
           <w:tcPr>
             <w:tcW w:w="3100" w:type="dxa"/>
@@ -605,8 +628,17 @@
                 <w:rFonts w:ascii="Calibri" w:eastAsia="Calibri" w:hAnsi="Calibri" w:cs="Calibri"/>
                 <w:color w:val="2A1D12"/>
               </w:rPr>
-              <w:t>25 de Mayo</w:t>
-            </w:r>
+              <w:t xml:space="preserve">25 de </w:t>
+            </w:r>
+            <w:proofErr w:type="gramStart"/>
+            <w:r>
+              <w:rPr>
+                <w:rFonts w:ascii="Calibri" w:eastAsia="Calibri" w:hAnsi="Calibri" w:cs="Calibri"/>
+                <w:color w:val="2A1D12"/>
+              </w:rPr>
+              <w:t>Mayo</w:t>
+            </w:r>
+            <w:proofErr w:type="gramEnd"/>
           </w:p>
         </w:tc>
         <w:tc>
@@ -655,12 +687,6 @@
         </w:tc>
       </w:tr>
       <w:tr>
-        <w:tblPrEx>
-          <w:tblCellMar>
-            <w:top w:w="0" w:type="dxa"/>
-            <w:bottom w:w="0" w:type="dxa"/>
-          </w:tblCellMar>
-        </w:tblPrEx>
         <w:tc>
           <w:tcPr>
             <w:tcW w:w="3100" w:type="dxa"/>
@@ -703,8 +729,17 @@
                 <w:rFonts w:ascii="Calibri" w:eastAsia="Calibri" w:hAnsi="Calibri" w:cs="Calibri"/>
                 <w:color w:val="2A1D12"/>
               </w:rPr>
-              <w:t>25 de Mayo</w:t>
-            </w:r>
+              <w:t xml:space="preserve">25 de </w:t>
+            </w:r>
+            <w:proofErr w:type="gramStart"/>
+            <w:r>
+              <w:rPr>
+                <w:rFonts w:ascii="Calibri" w:eastAsia="Calibri" w:hAnsi="Calibri" w:cs="Calibri"/>
+                <w:color w:val="2A1D12"/>
+              </w:rPr>
+              <w:t>Mayo</w:t>
+            </w:r>
+            <w:proofErr w:type="gramEnd"/>
           </w:p>
         </w:tc>
         <w:tc>
@@ -785,7 +820,127 @@
           <w:sz w:val="22"/>
           <w:szCs w:val="22"/>
         </w:rPr>
-        <w:t>El mismo equipamiento y arquitectura que ya está en funcionamiento en Aire Saladillo: sensores de bajo costo out-of-the-box (PurpleAir o AirGradient según disponibilidad), que miden material particulado (PM1.0 / PM2.5 / PM10), compuestos orgánicos volátiles (COV), NOx, CO₂, temperatura, humedad y presión.</w:t>
+        <w:t xml:space="preserve">El mismo equipamiento y arquitectura que ya está en funcionamiento en Aire Saladillo: sensores de bajo costo </w:t>
+      </w:r>
+      <w:proofErr w:type="spellStart"/>
+      <w:r>
+        <w:rPr>
+          <w:rFonts w:ascii="Calibri" w:eastAsia="Calibri" w:hAnsi="Calibri" w:cs="Calibri"/>
+          <w:color w:val="2A1D12"/>
+          <w:sz w:val="22"/>
+          <w:szCs w:val="22"/>
+        </w:rPr>
+        <w:t>out</w:t>
+      </w:r>
+      <w:proofErr w:type="spellEnd"/>
+      <w:r>
+        <w:rPr>
+          <w:rFonts w:ascii="Calibri" w:eastAsia="Calibri" w:hAnsi="Calibri" w:cs="Calibri"/>
+          <w:color w:val="2A1D12"/>
+          <w:sz w:val="22"/>
+          <w:szCs w:val="22"/>
+        </w:rPr>
+        <w:t>-</w:t>
+      </w:r>
+      <w:proofErr w:type="spellStart"/>
+      <w:r>
+        <w:rPr>
+          <w:rFonts w:ascii="Calibri" w:eastAsia="Calibri" w:hAnsi="Calibri" w:cs="Calibri"/>
+          <w:color w:val="2A1D12"/>
+          <w:sz w:val="22"/>
+          <w:szCs w:val="22"/>
+        </w:rPr>
+        <w:t>of</w:t>
+      </w:r>
+      <w:proofErr w:type="spellEnd"/>
+      <w:r>
+        <w:rPr>
+          <w:rFonts w:ascii="Calibri" w:eastAsia="Calibri" w:hAnsi="Calibri" w:cs="Calibri"/>
+          <w:color w:val="2A1D12"/>
+          <w:sz w:val="22"/>
+          <w:szCs w:val="22"/>
+        </w:rPr>
+        <w:t>-</w:t>
+      </w:r>
+      <w:proofErr w:type="spellStart"/>
+      <w:r>
+        <w:rPr>
+          <w:rFonts w:ascii="Calibri" w:eastAsia="Calibri" w:hAnsi="Calibri" w:cs="Calibri"/>
+          <w:color w:val="2A1D12"/>
+          <w:sz w:val="22"/>
+          <w:szCs w:val="22"/>
+        </w:rPr>
+        <w:t>the</w:t>
+      </w:r>
+      <w:proofErr w:type="spellEnd"/>
+      <w:r>
+        <w:rPr>
+          <w:rFonts w:ascii="Calibri" w:eastAsia="Calibri" w:hAnsi="Calibri" w:cs="Calibri"/>
+          <w:color w:val="2A1D12"/>
+          <w:sz w:val="22"/>
+          <w:szCs w:val="22"/>
+        </w:rPr>
+        <w:t>-box (</w:t>
+      </w:r>
+      <w:proofErr w:type="spellStart"/>
+      <w:r>
+        <w:rPr>
+          <w:rFonts w:ascii="Calibri" w:eastAsia="Calibri" w:hAnsi="Calibri" w:cs="Calibri"/>
+          <w:color w:val="2A1D12"/>
+          <w:sz w:val="22"/>
+          <w:szCs w:val="22"/>
+        </w:rPr>
+        <w:t>PurpleAir</w:t>
+      </w:r>
+      <w:proofErr w:type="spellEnd"/>
+      <w:r>
+        <w:rPr>
+          <w:rFonts w:ascii="Calibri" w:eastAsia="Calibri" w:hAnsi="Calibri" w:cs="Calibri"/>
+          <w:color w:val="2A1D12"/>
+          <w:sz w:val="22"/>
+          <w:szCs w:val="22"/>
+        </w:rPr>
+        <w:t xml:space="preserve"> o </w:t>
+      </w:r>
+      <w:proofErr w:type="spellStart"/>
+      <w:r>
+        <w:rPr>
+          <w:rFonts w:ascii="Calibri" w:eastAsia="Calibri" w:hAnsi="Calibri" w:cs="Calibri"/>
+          <w:color w:val="2A1D12"/>
+          <w:sz w:val="22"/>
+          <w:szCs w:val="22"/>
+        </w:rPr>
+        <w:t>AirGradient</w:t>
+      </w:r>
+      <w:proofErr w:type="spellEnd"/>
+      <w:r>
+        <w:rPr>
+          <w:rFonts w:ascii="Calibri" w:eastAsia="Calibri" w:hAnsi="Calibri" w:cs="Calibri"/>
+          <w:color w:val="2A1D12"/>
+          <w:sz w:val="22"/>
+          <w:szCs w:val="22"/>
+        </w:rPr>
+        <w:t xml:space="preserve"> según disponibilidad), que miden material particulado (PM1.0 / PM2.5 / PM10), compuestos orgánicos volátiles (COV), </w:t>
+      </w:r>
+      <w:proofErr w:type="spellStart"/>
+      <w:r>
+        <w:rPr>
+          <w:rFonts w:ascii="Calibri" w:eastAsia="Calibri" w:hAnsi="Calibri" w:cs="Calibri"/>
+          <w:color w:val="2A1D12"/>
+          <w:sz w:val="22"/>
+          <w:szCs w:val="22"/>
+        </w:rPr>
+        <w:t>NOx</w:t>
+      </w:r>
+      <w:proofErr w:type="spellEnd"/>
+      <w:r>
+        <w:rPr>
+          <w:rFonts w:ascii="Calibri" w:eastAsia="Calibri" w:hAnsi="Calibri" w:cs="Calibri"/>
+          <w:color w:val="2A1D12"/>
+          <w:sz w:val="22"/>
+          <w:szCs w:val="22"/>
+        </w:rPr>
+        <w:t>, CO₂, temperatura, humedad y presión.</w:t>
       </w:r>
     </w:p>
     <w:p>
@@ -840,12 +995,6 @@
         <w:gridCol w:w="6200"/>
       </w:tblGrid>
       <w:tr>
-        <w:tblPrEx>
-          <w:tblCellMar>
-            <w:top w:w="0" w:type="dxa"/>
-            <w:bottom w:w="0" w:type="dxa"/>
-          </w:tblCellMar>
-        </w:tblPrEx>
         <w:trPr>
           <w:tblHeader/>
         </w:trPr>
@@ -903,12 +1052,6 @@
         </w:tc>
       </w:tr>
       <w:tr>
-        <w:tblPrEx>
-          <w:tblCellMar>
-            <w:top w:w="0" w:type="dxa"/>
-            <w:bottom w:w="0" w:type="dxa"/>
-          </w:tblCellMar>
-        </w:tblPrEx>
         <w:tc>
           <w:tcPr>
             <w:tcW w:w="2600" w:type="dxa"/>
@@ -957,12 +1100,6 @@
         </w:tc>
       </w:tr>
       <w:tr>
-        <w:tblPrEx>
-          <w:tblCellMar>
-            <w:top w:w="0" w:type="dxa"/>
-            <w:bottom w:w="0" w:type="dxa"/>
-          </w:tblCellMar>
-        </w:tblPrEx>
         <w:tc>
           <w:tcPr>
             <w:tcW w:w="2600" w:type="dxa"/>
@@ -1006,18 +1143,28 @@
                 <w:rFonts w:ascii="Calibri" w:eastAsia="Calibri" w:hAnsi="Calibri" w:cs="Calibri"/>
                 <w:color w:val="2A1D12"/>
               </w:rPr>
-              <w:t>Un tomacorriente a alcance del cable de alimentación del sensor (o la posibilidad de extenderlo). El consumo es bajo, comparable al de un router hogareño.</w:t>
+              <w:t xml:space="preserve">Un tomacorriente a alcance del cable de alimentación del sensor (o la posibilidad de extenderlo). El consumo es bajo, comparable al de un </w:t>
+            </w:r>
+            <w:proofErr w:type="spellStart"/>
+            <w:r>
+              <w:rPr>
+                <w:rFonts w:ascii="Calibri" w:eastAsia="Calibri" w:hAnsi="Calibri" w:cs="Calibri"/>
+                <w:color w:val="2A1D12"/>
+              </w:rPr>
+              <w:t>router</w:t>
+            </w:r>
+            <w:proofErr w:type="spellEnd"/>
+            <w:r>
+              <w:rPr>
+                <w:rFonts w:ascii="Calibri" w:eastAsia="Calibri" w:hAnsi="Calibri" w:cs="Calibri"/>
+                <w:color w:val="2A1D12"/>
+              </w:rPr>
+              <w:t xml:space="preserve"> hogareño.</w:t>
             </w:r>
           </w:p>
         </w:tc>
       </w:tr>
       <w:tr>
-        <w:tblPrEx>
-          <w:tblCellMar>
-            <w:top w:w="0" w:type="dxa"/>
-            <w:bottom w:w="0" w:type="dxa"/>
-          </w:tblCellMar>
-        </w:tblPrEx>
         <w:tc>
           <w:tcPr>
             <w:tcW w:w="2600" w:type="dxa"/>
@@ -1060,18 +1207,28 @@
                 <w:rFonts w:ascii="Calibri" w:eastAsia="Calibri" w:hAnsi="Calibri" w:cs="Calibri"/>
                 <w:color w:val="2A1D12"/>
               </w:rPr>
-              <w:t>Acceso a la red WiFi de la institución (SSID y contraseña). Si no es posible, se evalúa una alternativa por datos móviles caso por caso.</w:t>
+              <w:t xml:space="preserve">Acceso a la red </w:t>
+            </w:r>
+            <w:proofErr w:type="spellStart"/>
+            <w:r>
+              <w:rPr>
+                <w:rFonts w:ascii="Calibri" w:eastAsia="Calibri" w:hAnsi="Calibri" w:cs="Calibri"/>
+                <w:color w:val="2A1D12"/>
+              </w:rPr>
+              <w:t>WiFi</w:t>
+            </w:r>
+            <w:proofErr w:type="spellEnd"/>
+            <w:r>
+              <w:rPr>
+                <w:rFonts w:ascii="Calibri" w:eastAsia="Calibri" w:hAnsi="Calibri" w:cs="Calibri"/>
+                <w:color w:val="2A1D12"/>
+              </w:rPr>
+              <w:t xml:space="preserve"> de la institución (SSID y contraseña). Si no es posible, se evalúa una alternativa por datos móviles caso por caso.</w:t>
             </w:r>
           </w:p>
         </w:tc>
       </w:tr>
       <w:tr>
-        <w:tblPrEx>
-          <w:tblCellMar>
-            <w:top w:w="0" w:type="dxa"/>
-            <w:bottom w:w="0" w:type="dxa"/>
-          </w:tblCellMar>
-        </w:tblPrEx>
         <w:tc>
           <w:tcPr>
             <w:tcW w:w="2600" w:type="dxa"/>
@@ -1120,12 +1277,6 @@
         </w:tc>
       </w:tr>
       <w:tr>
-        <w:tblPrEx>
-          <w:tblCellMar>
-            <w:top w:w="0" w:type="dxa"/>
-            <w:bottom w:w="0" w:type="dxa"/>
-          </w:tblCellMar>
-        </w:tblPrEx>
         <w:tc>
           <w:tcPr>
             <w:tcW w:w="2600" w:type="dxa"/>
@@ -1224,12 +1375,6 @@
         <w:gridCol w:w="4900"/>
       </w:tblGrid>
       <w:tr>
-        <w:tblPrEx>
-          <w:tblCellMar>
-            <w:top w:w="0" w:type="dxa"/>
-            <w:bottom w:w="0" w:type="dxa"/>
-          </w:tblCellMar>
-        </w:tblPrEx>
         <w:trPr>
           <w:tblHeader/>
         </w:trPr>
@@ -1246,6 +1391,7 @@
             <w:vAlign w:val="center"/>
           </w:tcPr>
           <w:p>
+            <w:proofErr w:type="gramStart"/>
             <w:r>
               <w:rPr>
                 <w:rFonts w:ascii="Calibri" w:eastAsia="Calibri" w:hAnsi="Calibri" w:cs="Calibri"/>
@@ -1257,6 +1403,7 @@
               </w:rPr>
               <w:t>CUÁNDO</w:t>
             </w:r>
+            <w:proofErr w:type="gramEnd"/>
           </w:p>
         </w:tc>
         <w:tc>
@@ -1313,12 +1460,6 @@
         </w:tc>
       </w:tr>
       <w:tr>
-        <w:tblPrEx>
-          <w:tblCellMar>
-            <w:top w:w="0" w:type="dxa"/>
-            <w:bottom w:w="0" w:type="dxa"/>
-          </w:tblCellMar>
-        </w:tblPrEx>
         <w:tc>
           <w:tcPr>
             <w:tcW w:w="1600" w:type="dxa"/>
@@ -1389,12 +1530,6 @@
         </w:tc>
       </w:tr>
       <w:tr>
-        <w:tblPrEx>
-          <w:tblCellMar>
-            <w:top w:w="0" w:type="dxa"/>
-            <w:bottom w:w="0" w:type="dxa"/>
-          </w:tblCellMar>
-        </w:tblPrEx>
         <w:tc>
           <w:tcPr>
             <w:tcW w:w="1600" w:type="dxa"/>
@@ -1459,18 +1594,28 @@
                 <w:rFonts w:ascii="Calibri" w:eastAsia="Calibri" w:hAnsi="Calibri" w:cs="Calibri"/>
                 <w:color w:val="2A1D12"/>
               </w:rPr>
-              <w:t>Visita a cada institución para acordar junto al referente el punto exacto de instalación, y confirmar energía/WiFi disponibles.</w:t>
+              <w:t>Visita a cada institución para acordar junto al referente el punto exacto de instalación, y confirmar energía/</w:t>
+            </w:r>
+            <w:proofErr w:type="spellStart"/>
+            <w:r>
+              <w:rPr>
+                <w:rFonts w:ascii="Calibri" w:eastAsia="Calibri" w:hAnsi="Calibri" w:cs="Calibri"/>
+                <w:color w:val="2A1D12"/>
+              </w:rPr>
+              <w:t>WiFi</w:t>
+            </w:r>
+            <w:proofErr w:type="spellEnd"/>
+            <w:r>
+              <w:rPr>
+                <w:rFonts w:ascii="Calibri" w:eastAsia="Calibri" w:hAnsi="Calibri" w:cs="Calibri"/>
+                <w:color w:val="2A1D12"/>
+              </w:rPr>
+              <w:t xml:space="preserve"> disponibles.</w:t>
             </w:r>
           </w:p>
         </w:tc>
       </w:tr>
       <w:tr>
-        <w:tblPrEx>
-          <w:tblCellMar>
-            <w:top w:w="0" w:type="dxa"/>
-            <w:bottom w:w="0" w:type="dxa"/>
-          </w:tblCellMar>
-        </w:tblPrEx>
         <w:tc>
           <w:tcPr>
             <w:tcW w:w="1600" w:type="dxa"/>
@@ -1541,12 +1686,6 @@
         </w:tc>
       </w:tr>
       <w:tr>
-        <w:tblPrEx>
-          <w:tblCellMar>
-            <w:top w:w="0" w:type="dxa"/>
-            <w:bottom w:w="0" w:type="dxa"/>
-          </w:tblCellMar>
-        </w:tblPrEx>
         <w:tc>
           <w:tcPr>
             <w:tcW w:w="1600" w:type="dxa"/>
@@ -1675,26 +1814,6 @@
           <w:szCs w:val="22"/>
         </w:rPr>
         <w:t>Relevamiento en sitio: se agenda con cada referente en forma individual, sin necesidad de reunión conjunta.</w:t>
-      </w:r>
-    </w:p>
-    <w:p>
-      <w:pPr>
-        <w:pStyle w:val="Prrafodelista"/>
-        <w:numPr>
-          <w:ilvl w:val="0"/>
-          <w:numId w:val="2"/>
-        </w:numPr>
-        <w:spacing w:after="120" w:line="276" w:lineRule="auto"/>
-        <w:jc w:val="both"/>
-      </w:pPr>
-      <w:r>
-        <w:rPr>
-          <w:rFonts w:ascii="Calibri" w:eastAsia="Calibri" w:hAnsi="Calibri" w:cs="Calibri"/>
-          <w:color w:val="2A1D12"/>
-          <w:sz w:val="22"/>
-          <w:szCs w:val="22"/>
-        </w:rPr>
-        <w:t>Consultas o coordinación: lucianolamaita@gmail.com · más información del proyecto en profe.lemeit.ar y aq.lemeit.ar.</w:t>
       </w:r>
     </w:p>
     <w:p>

</xml_diff>